<commit_message>
manuscript: set author affiliation to Independent Researcher
Replaces the "Affiliation to be confirmed" placeholder in both the LaTeX and portable
front matter. "Independent Researcher" is the standard bioRxiv entry for an unaffiliated
author; a city/country can be appended, or an institution swapped in, via the AFFIL
variable if that changes before submission. Deliverables regenerated.

Co-Authored-By: Claude Opus 4.8 <noreply@anthropic.com>
</commit_message>
<xml_diff>
--- a/manuscript/actinn-jax_preprint.docx
+++ b/manuscript/actinn-jax_preprint.docx
@@ -400,9 +400,6 @@
         </w:rPr>
         <w:t xml:space="preserve">Ian Driver</w:t>
       </w:r>
-      <w:r>
-        <w:t xml:space="preserve">¹˒*</w:t>
-      </w:r>
     </w:p>
     <w:p>
       <w:pPr>
@@ -413,13 +410,23 @@
           <w:i/>
           <w:iCs/>
         </w:rPr>
-        <w:t xml:space="preserve">¹ Affiliation to be confirmed.</w:t>
-      </w:r>
-      <w:r>
-        <w:t xml:space="preserve"> </w:t>
-      </w:r>
-      <w:r>
-        <w:t xml:space="preserve">· ** Correspondence: driver.ian@gmail.com*</w:t>
+        <w:t xml:space="preserve">Independent Researcher</w:t>
+      </w:r>
+      <w:r>
+        <w:t xml:space="preserve"> </w:t>
+      </w:r>
+      <w:r>
+        <w:t xml:space="preserve">·</w:t>
+      </w:r>
+      <w:r>
+        <w:t xml:space="preserve"> </w:t>
+      </w:r>
+      <w:r>
+        <w:rPr>
+          <w:i/>
+          <w:iCs/>
+        </w:rPr>
+        <w:t xml:space="preserve">Correspondence: driver.ian@gmail.com</w:t>
       </w:r>
     </w:p>
     <w:bookmarkStart w:id="9" w:name="introduction"/>

</xml_diff>

<commit_message>
paper: own the new method, keep the self-awareness on the benchmark
The previous framing read as apologising for existing -- 'a twelfth method is a
cost', 'nothing here argues it should displace' -- which is not the point. We are
adding a method and it earns its place: the original ACTINN no longer runs on current
toolchains, and the flat cached-reference inference is what makes the multi-stage
workflow practical.

The self-awareness belongs on the benchmark, not on the method: what we avoid is
concluding that the new method wins, which it does not.

Co-Authored-By: Claude Opus 5 <noreply@anthropic.com>
</commit_message>
<xml_diff>
--- a/manuscript/actinn-jax_preprint.docx
+++ b/manuscript/actinn-jax_preprint.docx
@@ -683,55 +683,105 @@
           <w:b/>
           <w:bCs/>
         </w:rPr>
-        <w:t xml:space="preserve">A twelfth method is a cost.</w:t>
-      </w:r>
-      <w:r>
-        <w:t xml:space="preserve"> </w:t>
-      </w:r>
-      <w:r>
-        <w:t xml:space="preserve">Adding one more entry to a crowded field is not by itself a</w:t>
-      </w:r>
-      <w:r>
-        <w:t xml:space="preserve"> </w:t>
-      </w:r>
-      <w:r>
-        <w:t xml:space="preserve">service to it ([xkcd 927]). actinn-jax exists because the original ACTINN no longer installs</w:t>
-      </w:r>
-      <w:r>
-        <w:t xml:space="preserve"> </w:t>
-      </w:r>
-      <w:r>
-        <w:t xml:space="preserve">or runs on current toolchains, not because the field lacked a classifier, and nothing here</w:t>
-      </w:r>
-      <w:r>
-        <w:t xml:space="preserve"> </w:t>
-      </w:r>
-      <w:r>
-        <w:t xml:space="preserve">argues that it should displace the methods it is measured against — on accuracy it sits</w:t>
-      </w:r>
-      <w:r>
-        <w:t xml:space="preserve"> </w:t>
-      </w:r>
-      <w:r>
-        <w:t xml:space="preserve">inside a five-way cluster that it does not lead. What we think is worth adding is the</w:t>
-      </w:r>
-      <w:r>
-        <w:t xml:space="preserve"> </w:t>
-      </w:r>
-      <w:r>
-        <w:t xml:space="preserve">comparison itself, the cost axes it reports, and a workflow that composes existing pieces;</w:t>
-      </w:r>
-      <w:r>
-        <w:t xml:space="preserve"> </w:t>
-      </w:r>
-      <w:r>
-        <w:t xml:space="preserve">where a better-resourced model already exists, the productive move is to build on it rather</w:t>
-      </w:r>
-      <w:r>
-        <w:t xml:space="preserve"> </w:t>
-      </w:r>
-      <w:r>
-        <w:t xml:space="preserve">than to compete with it (§3.5).</w:t>
+        <w:t xml:space="preserve">On adding a twelfth method to a crowded field.</w:t>
+      </w:r>
+      <w:r>
+        <w:t xml:space="preserve"> </w:t>
+      </w:r>
+      <w:r>
+        <w:t xml:space="preserve">We are adding one, and we think it earns</w:t>
+      </w:r>
+      <w:r>
+        <w:t xml:space="preserve"> </w:t>
+      </w:r>
+      <w:r>
+        <w:t xml:space="preserve">its place: the original ACTINN no longer installs or runs on current toolchains, and the</w:t>
+      </w:r>
+      <w:r>
+        <w:t xml:space="preserve"> </w:t>
+      </w:r>
+      <w:r>
+        <w:t xml:space="preserve">reimplementation’s flat, sub-second, memory-bounded inference over a cached reference is what</w:t>
+      </w:r>
+      <w:r>
+        <w:t xml:space="preserve"> </w:t>
+      </w:r>
+      <w:r>
+        <w:t xml:space="preserve">makes the multi-stage workflow of §3.5 practical on a laptop. What we are</w:t>
+      </w:r>
+      <w:r>
+        <w:t xml:space="preserve"> </w:t>
+      </w:r>
+      <w:r>
+        <w:rPr>
+          <w:i/>
+          <w:iCs/>
+        </w:rPr>
+        <w:t xml:space="preserve">not</w:t>
+      </w:r>
+      <w:r>
+        <w:t xml:space="preserve"> </w:t>
+      </w:r>
+      <w:r>
+        <w:t xml:space="preserve">doing is the</w:t>
+      </w:r>
+      <w:r>
+        <w:t xml:space="preserve"> </w:t>
+      </w:r>
+      <w:r>
+        <w:t xml:space="preserve">move that makes method papers hard to trust — concluding that the new method wins. It does</w:t>
+      </w:r>
+      <w:r>
+        <w:t xml:space="preserve"> </w:t>
+      </w:r>
+      <w:r>
+        <w:t xml:space="preserve">not: on accuracy it sits inside a five-way cluster it does not lead, the panel was assembled</w:t>
+      </w:r>
+      <w:r>
+        <w:t xml:space="preserve"> </w:t>
+      </w:r>
+      <w:r>
+        <w:t xml:space="preserve">to include the baselines most likely to beat it, and they do. A field with a dozen working</w:t>
+      </w:r>
+      <w:r>
+        <w:t xml:space="preserve"> </w:t>
+      </w:r>
+      <w:r>
+        <w:t xml:space="preserve">methods ([xkcd 927]) is a good reason to be specific about what a new entry is</w:t>
+      </w:r>
+      <w:r>
+        <w:t xml:space="preserve"> </w:t>
+      </w:r>
+      <w:r>
+        <w:rPr>
+          <w:i/>
+          <w:iCs/>
+        </w:rPr>
+        <w:t xml:space="preserve">for</w:t>
+      </w:r>
+      <w:r>
+        <w:t xml:space="preserve"> </w:t>
+      </w:r>
+      <w:r>
+        <w:t xml:space="preserve">— here,</w:t>
+      </w:r>
+      <w:r>
+        <w:t xml:space="preserve"> </w:t>
+      </w:r>
+      <w:r>
+        <w:t xml:space="preserve">a cost profile that lets several models be chained — rather than to claim it supersedes what</w:t>
+      </w:r>
+      <w:r>
+        <w:t xml:space="preserve"> </w:t>
+      </w:r>
+      <w:r>
+        <w:t xml:space="preserve">exists. Where a better-resourced model already exists, the productive move is to build on it</w:t>
+      </w:r>
+      <w:r>
+        <w:t xml:space="preserve"> </w:t>
+      </w:r>
+      <w:r>
+        <w:t xml:space="preserve">(§3.5).</w:t>
       </w:r>
     </w:p>
     <w:p>

</xml_diff>

<commit_message>
docs: cite the Zenodo reference archive
</commit_message>
<xml_diff>
--- a/manuscript/actinn-jax_preprint.docx
+++ b/manuscript/actinn-jax_preprint.docx
@@ -10601,7 +10601,7 @@
       </w:r>
     </w:p>
     <w:bookmarkEnd w:id="45"/>
-    <w:bookmarkStart w:id="50" w:name="data-code-availability"/>
+    <w:bookmarkStart w:id="52" w:name="data-code-availability"/>
     <w:p>
       <w:pPr>
         <w:pStyle w:val="Heading1"/>
@@ -10770,22 +10770,13 @@
         <w:t xml:space="preserve">distill_train.py</w:t>
       </w:r>
       <w:r>
-        <w:t xml:space="preserve"> </w:t>
-      </w:r>
-      <w:r>
-        <w:t xml:space="preserve">and ships as</w:t>
-      </w:r>
-      <w:r>
-        <w:t xml:space="preserve"> </w:t>
-      </w:r>
-      <w:r>
-        <w:rPr>
-          <w:rStyle w:val="VerbatimChar"/>
-        </w:rPr>
-        <w:t xml:space="preserve">actinn_jax.bundled_reference("panhuman_distill_v1")</w:t>
-      </w:r>
-      <w:r>
-        <w:t xml:space="preserve">.</w:t>
+        <w:t xml:space="preserve">; the pan-mouse reference and the</w:t>
+      </w:r>
+      <w:r>
+        <w:t xml:space="preserve"> </w:t>
+      </w:r>
+      <w:r>
+        <w:t xml:space="preserve">Cell-Ontology hierarchy it depends on are in .</w:t>
       </w:r>
     </w:p>
     <w:p>
@@ -10793,6 +10784,160 @@
         <w:pStyle w:val="BodyText"/>
       </w:pPr>
       <w:r>
+        <w:rPr>
+          <w:b/>
+          <w:bCs/>
+        </w:rPr>
+        <w:t xml:space="preserve">Pre-trained references</w:t>
+      </w:r>
+      <w:r>
+        <w:t xml:space="preserve"> </w:t>
+      </w:r>
+      <w:r>
+        <w:t xml:space="preserve">— human (</w:t>
+      </w:r>
+      <w:r>
+        <w:rPr>
+          <w:rStyle w:val="VerbatimChar"/>
+        </w:rPr>
+        <w:t xml:space="preserve">broad_human_v1</w:t>
+      </w:r>
+      <w:r>
+        <w:t xml:space="preserve">,</w:t>
+      </w:r>
+      <w:r>
+        <w:t xml:space="preserve"> </w:t>
+      </w:r>
+      <w:r>
+        <w:rPr>
+          <w:rStyle w:val="VerbatimChar"/>
+        </w:rPr>
+        <w:t xml:space="preserve">panhuman_distill_v1</w:t>
+      </w:r>
+      <w:r>
+        <w:t xml:space="preserve">), mouse</w:t>
+      </w:r>
+      <w:r>
+        <w:t xml:space="preserve"> </w:t>
+      </w:r>
+      <w:r>
+        <w:t xml:space="preserve">(</w:t>
+      </w:r>
+      <w:r>
+        <w:rPr>
+          <w:rStyle w:val="VerbatimChar"/>
+        </w:rPr>
+        <w:t xml:space="preserve">broad_mouse_v1</w:t>
+      </w:r>
+      <w:r>
+        <w:t xml:space="preserve">) and focused liver (</w:t>
+      </w:r>
+      <w:r>
+        <w:rPr>
+          <w:rStyle w:val="VerbatimChar"/>
+        </w:rPr>
+        <w:t xml:space="preserve">liver_hlica_v1</w:t>
+      </w:r>
+      <w:r>
+        <w:t xml:space="preserve">/</w:t>
+      </w:r>
+      <w:r>
+        <w:rPr>
+          <w:rStyle w:val="VerbatimChar"/>
+        </w:rPr>
+        <w:t xml:space="preserve">v2</w:t>
+      </w:r>
+      <w:r>
+        <w:t xml:space="preserve">) — are archived at</w:t>
+      </w:r>
+      <w:r>
+        <w:t xml:space="preserve"> </w:t>
+      </w:r>
+      <w:hyperlink r:id="rId47">
+        <w:r>
+          <w:rPr>
+            <w:rStyle w:val="Hyperlink"/>
+          </w:rPr>
+          <w:t xml:space="preserve">doi:10.5281/zenodo.21688151</w:t>
+        </w:r>
+      </w:hyperlink>
+      <w:r>
+        <w:t xml:space="preserve"> </w:t>
+      </w:r>
+      <w:r>
+        <w:t xml:space="preserve">(CC BY 4.0; cite the</w:t>
+      </w:r>
+      <w:r>
+        <w:t xml:space="preserve"> </w:t>
+      </w:r>
+      <w:r>
+        <w:t xml:space="preserve">concept DOI</w:t>
+      </w:r>
+      <w:r>
+        <w:t xml:space="preserve"> </w:t>
+      </w:r>
+      <w:hyperlink r:id="rId48">
+        <w:r>
+          <w:rPr>
+            <w:rStyle w:val="Hyperlink"/>
+          </w:rPr>
+          <w:t xml:space="preserve">10.5281/zenodo.21688150</w:t>
+        </w:r>
+      </w:hyperlink>
+      <w:r>
+        <w:t xml:space="preserve"> </w:t>
+      </w:r>
+      <w:r>
+        <w:t xml:space="preserve">for the</w:t>
+      </w:r>
+      <w:r>
+        <w:t xml:space="preserve"> </w:t>
+      </w:r>
+      <w:r>
+        <w:t xml:space="preserve">latest version).</w:t>
+      </w:r>
+      <w:r>
+        <w:t xml:space="preserve"> </w:t>
+      </w:r>
+      <w:r>
+        <w:rPr>
+          <w:rStyle w:val="VerbatimChar"/>
+        </w:rPr>
+        <w:t xml:space="preserve">actinn_jax.bundled_reference(name)</w:t>
+      </w:r>
+      <w:r>
+        <w:t xml:space="preserve"> </w:t>
+      </w:r>
+      <w:r>
+        <w:t xml:space="preserve">downloads and caches them on first</w:t>
+      </w:r>
+      <w:r>
+        <w:t xml:space="preserve"> </w:t>
+      </w:r>
+      <w:r>
+        <w:t xml:space="preserve">use, so no manual retrieval is needed;</w:t>
+      </w:r>
+      <w:r>
+        <w:t xml:space="preserve"> </w:t>
+      </w:r>
+      <w:r>
+        <w:rPr>
+          <w:rStyle w:val="VerbatimChar"/>
+        </w:rPr>
+        <w:t xml:space="preserve">actinn-jax fetch</w:t>
+      </w:r>
+      <w:r>
+        <w:t xml:space="preserve"> </w:t>
+      </w:r>
+      <w:r>
+        <w:t xml:space="preserve">pre-downloads for offline use.</w:t>
+      </w:r>
+    </w:p>
+    <w:p>
+      <w:pPr>
+        <w:pStyle w:val="BodyText"/>
+      </w:pPr>
+      <w:r>
         <w:t xml:space="preserve">HLiCA data © Edgar et al. 2026 (CC-BY 4.0), [doi:10.64898/2026.06.30.735539]. The distilled</w:t>
       </w:r>
       <w:r>
@@ -10820,7 +10965,7 @@
       <w:r>
         <w:t xml:space="preserve"> </w:t>
       </w:r>
-      <w:hyperlink r:id="rId47">
+      <w:hyperlink r:id="rId49">
         <w:r>
           <w:rPr>
             <w:rStyle w:val="Hyperlink"/>
@@ -10840,7 +10985,7 @@
       <w:r>
         <w:t xml:space="preserve"> </w:t>
       </w:r>
-      <w:hyperlink r:id="rId48">
+      <w:hyperlink r:id="rId50">
         <w:r>
           <w:rPr>
             <w:rStyle w:val="Hyperlink"/>
@@ -10869,7 +11014,7 @@
       <w:r>
         <w:t xml:space="preserve"> </w:t>
       </w:r>
-      <w:hyperlink r:id="rId49">
+      <w:hyperlink r:id="rId51">
         <w:r>
           <w:rPr>
             <w:rStyle w:val="Hyperlink"/>
@@ -10899,8 +11044,8 @@
         <w:t xml:space="preserve">.</w:t>
       </w:r>
     </w:p>
-    <w:bookmarkEnd w:id="50"/>
-    <w:bookmarkStart w:id="51" w:name="references"/>
+    <w:bookmarkEnd w:id="52"/>
+    <w:bookmarkStart w:id="53" w:name="references"/>
     <w:p>
       <w:pPr>
         <w:pStyle w:val="Heading1"/>
@@ -11377,7 +11522,7 @@
         <w:t xml:space="preserve">927. xkcd.com/927.</w:t>
       </w:r>
     </w:p>
-    <w:bookmarkEnd w:id="51"/>
+    <w:bookmarkEnd w:id="53"/>
     <w:sectPr>
       <w:footnotePr>
         <w:numRestart w:val="eachSect"/>

</xml_diff>

<commit_message>
paper: say 'no GPU' instead of 'takes the accelerator out of the build'
'Accelerator' was standing in for GPU/MPS across four sentences, and the abstract's
'takes the accelerator out of the build' asked the reader to unpack three compressed
ideas at once: that building a reference normally requires a GPU, that the GPU is needed
for the hierarchy step specifically, and that a Cell-Ontology hierarchy replaces it.

The abstract now says the hierarchy 'removes the GPU step from building a reference',
and the other three uses say 'no GPU' plainly.
</commit_message>
<xml_diff>
--- a/manuscript/actinn-jax_preprint.docx
+++ b/manuscript/actinn-jax_preprint.docx
@@ -227,7 +227,7 @@
         <w:t xml:space="preserve">end-to-end workflows that a low, flat cost profile makes practical</w:t>
       </w:r>
       <w:r>
-        <w:t xml:space="preserve">, on human data and — via a Cell-Ontology-derived hierarchy that takes the accelerator out of the build — on mouse: annotating an unknown human dataset from a</w:t>
+        <w:t xml:space="preserve">, on human data and — via a hierarchy derived from the Cell Ontology, which removes the GPU step from building a reference — on mouse: annotating an unknown human dataset from a</w:t>
       </w:r>
       <w:r>
         <w:t xml:space="preserve"> </w:t>
@@ -4862,7 +4862,7 @@
         <w:pStyle w:val="FirstParagraph"/>
       </w:pPr>
       <w:r>
-        <w:t xml:space="preserve">A broad reference can also be built without labels or an accelerator, by taking both the label</w:t>
+        <w:t xml:space="preserve">A broad reference can also be built without labels and without a GPU, by taking both the label</w:t>
       </w:r>
       <w:r>
         <w:t xml:space="preserve"> </w:t>
@@ -9157,7 +9157,7 @@
           <w:b/>
           <w:bCs/>
         </w:rPr>
-        <w:t xml:space="preserve">no accelerator and no</w:t>
+        <w:t xml:space="preserve">no GPU and no</w:t>
       </w:r>
       <w:r>
         <w:rPr>
@@ -9594,7 +9594,7 @@
           <w:b/>
           <w:bCs/>
         </w:rPr>
-        <w:t xml:space="preserve">A second organism, and a hierarchy with no accelerator in it.</w:t>
+        <w:t xml:space="preserve">A second organism, and a hierarchy that needs no GPU.</w:t>
       </w:r>
       <w:r>
         <w:t xml:space="preserve"> </w:t>

</xml_diff>

<commit_message>
paper: we are adding another method, not the twelfth one
'On adding a twelfth method to a crowded field' counted our benchmark panel as though it
were the field, and 'a field with a dozen working methods' said so outright. The
annotation literature holds far more methods than we benchmark; the panel size is a fact
about this comparison, not a census.

Now 'On adding another method to a crowded field' and 'a field already full of working
methods'. The self-aware point is unchanged and does not depend on a count.
</commit_message>
<xml_diff>
--- a/manuscript/actinn-jax_preprint.docx
+++ b/manuscript/actinn-jax_preprint.docx
@@ -693,7 +693,7 @@
           <w:b/>
           <w:bCs/>
         </w:rPr>
-        <w:t xml:space="preserve">On adding a twelfth method to a crowded field.</w:t>
+        <w:t xml:space="preserve">On adding another method to a crowded field.</w:t>
       </w:r>
       <w:r>
         <w:t xml:space="preserve"> </w:t>
@@ -751,7 +751,7 @@
         <w:t xml:space="preserve"> </w:t>
       </w:r>
       <w:r>
-        <w:t xml:space="preserve">to include the baselines most likely to beat it, and they do. A field with a dozen working</w:t>
+        <w:t xml:space="preserve">to include the baselines most likely to beat it, and they do. A field already full of working</w:t>
       </w:r>
       <w:r>
         <w:t xml:space="preserve"> </w:t>

</xml_diff>

<commit_message>
paper: order Table 10 by accuracy, like Table 3
Table 10 was ordered with actinn-jax first, above the mlp that actually leads it (0.837 vs
0.838), and had knn above xgboost despite scoring lower. Putting our own method at the top
of a table it does not lead is the exact move section 1 says the paper is not making.

Now descending by accuracy, matching Table 3. No claim in the text depends on the old
order: actinn-jax still ties mlp at ~2x the speed, and knn and logistic are still the
faster, less accurate pair.
</commit_message>
<xml_diff>
--- a/manuscript/actinn-jax_preprint.docx
+++ b/manuscript/actinn-jax_preprint.docx
@@ -12089,6 +12089,63 @@
               <w:pStyle w:val="Compact"/>
             </w:pPr>
             <w:r>
+              <w:t xml:space="preserve">mlp</w:t>
+            </w:r>
+          </w:p>
+        </w:tc>
+        <w:tc>
+          <w:tcPr/>
+          <w:p>
+            <w:pPr>
+              <w:pStyle w:val="Compact"/>
+            </w:pPr>
+            <w:r>
+              <w:t xml:space="preserve">0.838</w:t>
+            </w:r>
+          </w:p>
+        </w:tc>
+        <w:tc>
+          <w:tcPr/>
+          <w:p>
+            <w:pPr>
+              <w:pStyle w:val="Compact"/>
+            </w:pPr>
+            <w:r>
+              <w:t xml:space="preserve">0.664</w:t>
+            </w:r>
+          </w:p>
+        </w:tc>
+        <w:tc>
+          <w:tcPr/>
+          <w:p>
+            <w:pPr>
+              <w:pStyle w:val="Compact"/>
+            </w:pPr>
+            <w:r>
+              <w:t xml:space="preserve">327 s</w:t>
+            </w:r>
+          </w:p>
+        </w:tc>
+        <w:tc>
+          <w:tcPr/>
+          <w:p>
+            <w:pPr>
+              <w:pStyle w:val="Compact"/>
+            </w:pPr>
+            <w:r>
+              <w:t xml:space="preserve">19.9 GB</w:t>
+            </w:r>
+          </w:p>
+        </w:tc>
+      </w:tr>
+      <w:tr>
+        <w:tc>
+          <w:tcPr/>
+          <w:p>
+            <w:pPr>
+              <w:pStyle w:val="Compact"/>
+            </w:pPr>
+            <w:r>
               <w:rPr>
                 <w:b/>
                 <w:bCs/>
@@ -12154,51 +12211,51 @@
               <w:pStyle w:val="Compact"/>
             </w:pPr>
             <w:r>
-              <w:t xml:space="preserve">mlp</w:t>
-            </w:r>
-          </w:p>
-        </w:tc>
-        <w:tc>
-          <w:tcPr/>
-          <w:p>
-            <w:pPr>
-              <w:pStyle w:val="Compact"/>
-            </w:pPr>
-            <w:r>
-              <w:t xml:space="preserve">0.838</w:t>
-            </w:r>
-          </w:p>
-        </w:tc>
-        <w:tc>
-          <w:tcPr/>
-          <w:p>
-            <w:pPr>
-              <w:pStyle w:val="Compact"/>
-            </w:pPr>
-            <w:r>
-              <w:t xml:space="preserve">0.664</w:t>
-            </w:r>
-          </w:p>
-        </w:tc>
-        <w:tc>
-          <w:tcPr/>
-          <w:p>
-            <w:pPr>
-              <w:pStyle w:val="Compact"/>
-            </w:pPr>
-            <w:r>
-              <w:t xml:space="preserve">327 s</w:t>
-            </w:r>
-          </w:p>
-        </w:tc>
-        <w:tc>
-          <w:tcPr/>
-          <w:p>
-            <w:pPr>
-              <w:pStyle w:val="Compact"/>
-            </w:pPr>
-            <w:r>
-              <w:t xml:space="preserve">19.9 GB</w:t>
+              <w:t xml:space="preserve">logistic_regression</w:t>
+            </w:r>
+          </w:p>
+        </w:tc>
+        <w:tc>
+          <w:tcPr/>
+          <w:p>
+            <w:pPr>
+              <w:pStyle w:val="Compact"/>
+            </w:pPr>
+            <w:r>
+              <w:t xml:space="preserve">0.813</w:t>
+            </w:r>
+          </w:p>
+        </w:tc>
+        <w:tc>
+          <w:tcPr/>
+          <w:p>
+            <w:pPr>
+              <w:pStyle w:val="Compact"/>
+            </w:pPr>
+            <w:r>
+              <w:t xml:space="preserve">0.689</w:t>
+            </w:r>
+          </w:p>
+        </w:tc>
+        <w:tc>
+          <w:tcPr/>
+          <w:p>
+            <w:pPr>
+              <w:pStyle w:val="Compact"/>
+            </w:pPr>
+            <w:r>
+              <w:t xml:space="preserve">29 s</w:t>
+            </w:r>
+          </w:p>
+        </w:tc>
+        <w:tc>
+          <w:tcPr/>
+          <w:p>
+            <w:pPr>
+              <w:pStyle w:val="Compact"/>
+            </w:pPr>
+            <w:r>
+              <w:t xml:space="preserve">20.0 GB</w:t>
             </w:r>
           </w:p>
         </w:tc>
@@ -12211,51 +12268,51 @@
               <w:pStyle w:val="Compact"/>
             </w:pPr>
             <w:r>
-              <w:t xml:space="preserve">logistic_regression</w:t>
-            </w:r>
-          </w:p>
-        </w:tc>
-        <w:tc>
-          <w:tcPr/>
-          <w:p>
-            <w:pPr>
-              <w:pStyle w:val="Compact"/>
-            </w:pPr>
-            <w:r>
-              <w:t xml:space="preserve">0.813</w:t>
-            </w:r>
-          </w:p>
-        </w:tc>
-        <w:tc>
-          <w:tcPr/>
-          <w:p>
-            <w:pPr>
-              <w:pStyle w:val="Compact"/>
-            </w:pPr>
-            <w:r>
-              <w:t xml:space="preserve">0.689</w:t>
-            </w:r>
-          </w:p>
-        </w:tc>
-        <w:tc>
-          <w:tcPr/>
-          <w:p>
-            <w:pPr>
-              <w:pStyle w:val="Compact"/>
-            </w:pPr>
-            <w:r>
-              <w:t xml:space="preserve">29 s</w:t>
-            </w:r>
-          </w:p>
-        </w:tc>
-        <w:tc>
-          <w:tcPr/>
-          <w:p>
-            <w:pPr>
-              <w:pStyle w:val="Compact"/>
-            </w:pPr>
-            <w:r>
-              <w:t xml:space="preserve">20.0 GB</w:t>
+              <w:t xml:space="preserve">xgboost</w:t>
+            </w:r>
+          </w:p>
+        </w:tc>
+        <w:tc>
+          <w:tcPr/>
+          <w:p>
+            <w:pPr>
+              <w:pStyle w:val="Compact"/>
+            </w:pPr>
+            <w:r>
+              <w:t xml:space="preserve">0.795</w:t>
+            </w:r>
+          </w:p>
+        </w:tc>
+        <w:tc>
+          <w:tcPr/>
+          <w:p>
+            <w:pPr>
+              <w:pStyle w:val="Compact"/>
+            </w:pPr>
+            <w:r>
+              <w:t xml:space="preserve">0.613</w:t>
+            </w:r>
+          </w:p>
+        </w:tc>
+        <w:tc>
+          <w:tcPr/>
+          <w:p>
+            <w:pPr>
+              <w:pStyle w:val="Compact"/>
+            </w:pPr>
+            <w:r>
+              <w:t xml:space="preserve">905 s</w:t>
+            </w:r>
+          </w:p>
+        </w:tc>
+        <w:tc>
+          <w:tcPr/>
+          <w:p>
+            <w:pPr>
+              <w:pStyle w:val="Compact"/>
+            </w:pPr>
+            <w:r>
+              <w:t xml:space="preserve">80.7 GB</w:t>
             </w:r>
           </w:p>
         </w:tc>
@@ -12325,51 +12382,51 @@
               <w:pStyle w:val="Compact"/>
             </w:pPr>
             <w:r>
-              <w:t xml:space="preserve">xgboost</w:t>
-            </w:r>
-          </w:p>
-        </w:tc>
-        <w:tc>
-          <w:tcPr/>
-          <w:p>
-            <w:pPr>
-              <w:pStyle w:val="Compact"/>
-            </w:pPr>
-            <w:r>
-              <w:t xml:space="preserve">0.795</w:t>
-            </w:r>
-          </w:p>
-        </w:tc>
-        <w:tc>
-          <w:tcPr/>
-          <w:p>
-            <w:pPr>
-              <w:pStyle w:val="Compact"/>
-            </w:pPr>
-            <w:r>
-              <w:t xml:space="preserve">0.613</w:t>
-            </w:r>
-          </w:p>
-        </w:tc>
-        <w:tc>
-          <w:tcPr/>
-          <w:p>
-            <w:pPr>
-              <w:pStyle w:val="Compact"/>
-            </w:pPr>
-            <w:r>
-              <w:t xml:space="preserve">905 s</w:t>
-            </w:r>
-          </w:p>
-        </w:tc>
-        <w:tc>
-          <w:tcPr/>
-          <w:p>
-            <w:pPr>
-              <w:pStyle w:val="Compact"/>
-            </w:pPr>
-            <w:r>
-              <w:t xml:space="preserve">80.7 GB</w:t>
+              <w:t xml:space="preserve">cellmapper_linear</w:t>
+            </w:r>
+          </w:p>
+        </w:tc>
+        <w:tc>
+          <w:tcPr/>
+          <w:p>
+            <w:pPr>
+              <w:pStyle w:val="Compact"/>
+            </w:pPr>
+            <w:r>
+              <w:t xml:space="preserve">0.776</w:t>
+            </w:r>
+          </w:p>
+        </w:tc>
+        <w:tc>
+          <w:tcPr/>
+          <w:p>
+            <w:pPr>
+              <w:pStyle w:val="Compact"/>
+            </w:pPr>
+            <w:r>
+              <w:t xml:space="preserve">0.553</w:t>
+            </w:r>
+          </w:p>
+        </w:tc>
+        <w:tc>
+          <w:tcPr/>
+          <w:p>
+            <w:pPr>
+              <w:pStyle w:val="Compact"/>
+            </w:pPr>
+            <w:r>
+              <w:t xml:space="preserve">58 s</w:t>
+            </w:r>
+          </w:p>
+        </w:tc>
+        <w:tc>
+          <w:tcPr/>
+          <w:p>
+            <w:pPr>
+              <w:pStyle w:val="Compact"/>
+            </w:pPr>
+            <w:r>
+              <w:t xml:space="preserve">31.5 GB</w:t>
             </w:r>
           </w:p>
         </w:tc>
@@ -12382,63 +12439,6 @@
               <w:pStyle w:val="Compact"/>
             </w:pPr>
             <w:r>
-              <w:t xml:space="preserve">cellmapper_linear</w:t>
-            </w:r>
-          </w:p>
-        </w:tc>
-        <w:tc>
-          <w:tcPr/>
-          <w:p>
-            <w:pPr>
-              <w:pStyle w:val="Compact"/>
-            </w:pPr>
-            <w:r>
-              <w:t xml:space="preserve">0.776</w:t>
-            </w:r>
-          </w:p>
-        </w:tc>
-        <w:tc>
-          <w:tcPr/>
-          <w:p>
-            <w:pPr>
-              <w:pStyle w:val="Compact"/>
-            </w:pPr>
-            <w:r>
-              <w:t xml:space="preserve">0.553</w:t>
-            </w:r>
-          </w:p>
-        </w:tc>
-        <w:tc>
-          <w:tcPr/>
-          <w:p>
-            <w:pPr>
-              <w:pStyle w:val="Compact"/>
-            </w:pPr>
-            <w:r>
-              <w:t xml:space="preserve">58 s</w:t>
-            </w:r>
-          </w:p>
-        </w:tc>
-        <w:tc>
-          <w:tcPr/>
-          <w:p>
-            <w:pPr>
-              <w:pStyle w:val="Compact"/>
-            </w:pPr>
-            <w:r>
-              <w:t xml:space="preserve">31.5 GB</w:t>
-            </w:r>
-          </w:p>
-        </w:tc>
-      </w:tr>
-      <w:tr>
-        <w:tc>
-          <w:tcPr/>
-          <w:p>
-            <w:pPr>
-              <w:pStyle w:val="Compact"/>
-            </w:pPr>
-            <w:r>
               <w:t xml:space="preserve">naive_bayes</w:t>
             </w:r>
           </w:p>
@@ -12531,7 +12531,7 @@
         <w:t xml:space="preserve"> </w:t>
       </w:r>
       <w:r>
-        <w:t xml:space="preserve">datasets.</w:t>
+        <w:t xml:space="preserve">datasets, ordered by accuracy as in Table 3.</w:t>
       </w:r>
     </w:p>
     <w:p>

</xml_diff>

<commit_message>
paper: order Table 7 descending, and stop leaning on row order in the prose
The two controls were inverted: random grouping (0.539) sat above flat (0.547). Now
descending, with the caption enumerating the rows in their new order.

'Random lands on flat' read left-to-right off the old layout and no longer parses once the
rows move, so it now says what it means: random grouping lands at flat rather than between
flat and the ontology. That is the actual claim -- the structure does the work, not the
mere presence of groups.

Table 6 stays ascending: it builds baseline -> teacher -> distilled student, and the
caption names them in that order.
</commit_message>
<xml_diff>
--- a/manuscript/actinn-jax_preprint.docx
+++ b/manuscript/actinn-jax_preprint.docx
@@ -10340,7 +10340,7 @@
               <w:pStyle w:val="Compact"/>
             </w:pPr>
             <w:r>
-              <w:t xml:space="preserve">random grouping, same group sizes</w:t>
+              <w:t xml:space="preserve">flat, no hierarchy</w:t>
             </w:r>
           </w:p>
         </w:tc>
@@ -10352,7 +10352,7 @@
               <w:jc w:val="right"/>
             </w:pPr>
             <w:r>
-              <w:t xml:space="preserve">0.539</w:t>
+              <w:t xml:space="preserve">0.547</w:t>
             </w:r>
           </w:p>
         </w:tc>
@@ -10365,7 +10365,7 @@
               <w:pStyle w:val="Compact"/>
             </w:pPr>
             <w:r>
-              <w:t xml:space="preserve">flat, no hierarchy</w:t>
+              <w:t xml:space="preserve">random grouping, same group sizes</w:t>
             </w:r>
           </w:p>
         </w:tc>
@@ -10377,7 +10377,7 @@
               <w:jc w:val="right"/>
             </w:pPr>
             <w:r>
-              <w:t xml:space="preserve">0.547</w:t>
+              <w:t xml:space="preserve">0.539</w:t>
             </w:r>
           </w:p>
         </w:tc>
@@ -10398,19 +10398,19 @@
         <w:t xml:space="preserve"> </w:t>
       </w:r>
       <w:r>
-        <w:t xml:space="preserve">Coarse-hierarchy ablation. Ontology concordance on the held-out lung atlas for a</w:t>
-      </w:r>
-      <w:r>
-        <w:t xml:space="preserve"> </w:t>
-      </w:r>
-      <w:r>
-        <w:t xml:space="preserve">Cell Ontology lineage hierarchy, a random grouping with the same group sizes, and no hierarchy</w:t>
-      </w:r>
-      <w:r>
-        <w:t xml:space="preserve"> </w:t>
-      </w:r>
-      <w:r>
-        <w:t xml:space="preserve">at all.</w:t>
+        <w:t xml:space="preserve">Coarse-hierarchy ablation, ordered by accuracy. Ontology concordance on the</w:t>
+      </w:r>
+      <w:r>
+        <w:t xml:space="preserve"> </w:t>
+      </w:r>
+      <w:r>
+        <w:t xml:space="preserve">held-out lung atlas for a Cell Ontology lineage hierarchy, no hierarchy at all, and a random</w:t>
+      </w:r>
+      <w:r>
+        <w:t xml:space="preserve"> </w:t>
+      </w:r>
+      <w:r>
+        <w:t xml:space="preserve">grouping with the same group sizes as the ontology one.</w:t>
       </w:r>
     </w:p>
     <w:p>
@@ -10418,13 +10418,13 @@
         <w:pStyle w:val="BodyText"/>
       </w:pPr>
       <w:r>
-        <w:t xml:space="preserve">Random lands on flat, so it is the structure doing the work rather than the mere presence of</w:t>
-      </w:r>
-      <w:r>
-        <w:t xml:space="preserve"> </w:t>
-      </w:r>
-      <w:r>
-        <w:t xml:space="preserve">groups. On that basis,</w:t>
+        <w:t xml:space="preserve">Random grouping lands at flat rather than between flat and the ontology, so it is the</w:t>
+      </w:r>
+      <w:r>
+        <w:t xml:space="preserve"> </w:t>
+      </w:r>
+      <w:r>
+        <w:t xml:space="preserve">structure doing the work rather than the mere presence of groups. On that basis,</w:t>
       </w:r>
       <w:r>
         <w:t xml:space="preserve"> </w:t>

</xml_diff>

<commit_message>
paper: explain the hierarchy ablation instead of sloganising it
"it is the structure doing the work rather than the mere presence of groups" states a
conclusion without the reasoning, in words that only parse if you already knew the answer.

The passage now says what the control rules out and why the mechanism matters: each group
has its own fine classifier and the coarse call decides which one ever sees the cell, so a
group pays off only if the coarse classifier can recognise it AND the right answer is
inside it. Lineage groups manage both; same-size random groups manage neither -- which is
why random lands at flat rather than between flat and the ontology.

Also corrects a number I carried in from the wrong reference while writing it: the human
ablation uses 29 coarse groups (max(8, round(sqrt(867))), and 29 in
results_hierarchy_ablation.csv). 21 is the mouse reference, two sentences later.
</commit_message>
<xml_diff>
--- a/manuscript/actinn-jax_preprint.docx
+++ b/manuscript/actinn-jax_preprint.docx
@@ -10415,13 +10415,71 @@
         <w:pStyle w:val="BodyText"/>
       </w:pPr>
       <w:r>
-        <w:t xml:space="preserve">Random grouping lands at flat rather than between flat and the ontology, so it is the</w:t>
-      </w:r>
-      <w:r>
-        <w:t xml:space="preserve"> </w:t>
-      </w:r>
-      <w:r>
-        <w:t xml:space="preserve">structure doing the work rather than the mere presence of groups. On that basis,</w:t>
+        <w:t xml:space="preserve">Random grouping scores no better than no grouping at all (0.539 against 0.547), which rules</w:t>
+      </w:r>
+      <w:r>
+        <w:t xml:space="preserve"> </w:t>
+      </w:r>
+      <w:r>
+        <w:t xml:space="preserve">out the simplest explanation for the gain: that splitting 867 types into 29 smaller problems</w:t>
+      </w:r>
+      <w:r>
+        <w:t xml:space="preserve"> </w:t>
+      </w:r>
+      <w:r>
+        <w:t xml:space="preserve">makes each fine classifier’s job easier, something any split would do. What matters is</w:t>
+      </w:r>
+      <w:r>
+        <w:t xml:space="preserve"> </w:t>
+      </w:r>
+      <w:r>
+        <w:rPr>
+          <w:i/>
+          <w:iCs/>
+        </w:rPr>
+        <w:t xml:space="preserve">which</w:t>
+      </w:r>
+      <w:r>
+        <w:t xml:space="preserve"> </w:t>
+      </w:r>
+      <w:r>
+        <w:t xml:space="preserve">types share a group. Each group has its own fine classifier and the coarse call decides which</w:t>
+      </w:r>
+      <w:r>
+        <w:t xml:space="preserve"> </w:t>
+      </w:r>
+      <w:r>
+        <w:t xml:space="preserve">one ever sees the cell, so a group pays off only if the coarse classifier can recognize it</w:t>
+      </w:r>
+      <w:r>
+        <w:t xml:space="preserve"> </w:t>
+      </w:r>
+      <w:r>
+        <w:rPr>
+          <w:i/>
+          <w:iCs/>
+        </w:rPr>
+        <w:t xml:space="preserve">and</w:t>
+      </w:r>
+      <w:r>
+        <w:t xml:space="preserve"> </w:t>
+      </w:r>
+      <w:r>
+        <w:t xml:space="preserve">the right answer is inside it. Lineage groups manage both; groups of the same sizes</w:t>
+      </w:r>
+      <w:r>
+        <w:t xml:space="preserve"> </w:t>
+      </w:r>
+      <w:r>
+        <w:t xml:space="preserve">drawn at random manage neither.</w:t>
+      </w:r>
+    </w:p>
+    <w:p>
+      <w:pPr>
+        <w:pStyle w:val="BodyText"/>
+      </w:pPr>
+      <w:r>
+        <w:t xml:space="preserve">On that basis,</w:t>
       </w:r>
       <w:r>
         <w:t xml:space="preserve"> </w:t>

</xml_diff>

<commit_message>
paper: drop the speed/memory bar figure; Table 3 already has it
Figure 2 plotted fit time, predict time and peak memory as three bar panels. Table 3, on
the facing page, carries the same three columns for the same eleven methods, with the
accuracy they trade against -- which is the comparison worth making and the one the bars
could not show. Bars across two orders of magnitude also compress everything below xgboost
into an unreadable stub.

Removed, and figures renumbered 3-7 -> 2-6 with every cross-reference updated: the scaling
reference in the Pareto caption, the two gene-budget references in the Open Problems
ablations. Six figures, seventeen numbered captions, no gaps.
</commit_message>
<xml_diff>
--- a/manuscript/actinn-jax_preprint.docx
+++ b/manuscript/actinn-jax_preprint.docx
@@ -5816,7 +5816,7 @@
     </w:p>
     <w:bookmarkEnd w:id="45"/>
     <w:bookmarkEnd w:id="46"/>
-    <w:bookmarkStart w:id="77" w:name="results"/>
+    <w:bookmarkStart w:id="74" w:name="results"/>
     <w:p>
       <w:pPr>
         <w:pStyle w:val="Heading1"/>
@@ -5825,7 +5825,7 @@
         <w:t xml:space="preserve">Results</w:t>
       </w:r>
     </w:p>
-    <w:bookmarkStart w:id="53" w:name="accuracy-and-cost"/>
+    <w:bookmarkStart w:id="50" w:name="accuracy-and-cost"/>
     <w:p>
       <w:pPr>
         <w:pStyle w:val="Heading2"/>
@@ -5904,83 +5904,6 @@
         <w:pStyle w:val="BodyText"/>
       </w:pPr>
       <w:r>
-        <w:drawing>
-          <wp:inline>
-            <wp:extent cx="5334000" cy="1639186"/>
-            <wp:effectExtent b="0" l="0" r="0" t="0"/>
-            <wp:docPr descr="speed and memory" title="" id="51" name="Picture"/>
-            <a:graphic>
-              <a:graphicData uri="http://schemas.openxmlformats.org/drawingml/2006/picture">
-                <pic:pic>
-                  <pic:nvPicPr>
-                    <pic:cNvPr descr="/Users/iandriver/Downloads/actinn-jax-benchmark/docs/figures/fig_speed_memory.png" id="52" name="Picture"/>
-                    <pic:cNvPicPr>
-                      <a:picLocks noChangeArrowheads="1" noChangeAspect="1"/>
-                    </pic:cNvPicPr>
-                  </pic:nvPicPr>
-                  <pic:blipFill>
-                    <a:blip r:embed="rId50"/>
-                    <a:stretch>
-                      <a:fillRect/>
-                    </a:stretch>
-                  </pic:blipFill>
-                  <pic:spPr bwMode="auto">
-                    <a:xfrm>
-                      <a:off x="0" y="0"/>
-                      <a:ext cx="5334000" cy="1639186"/>
-                    </a:xfrm>
-                    <a:prstGeom prst="rect">
-                      <a:avLst/>
-                    </a:prstGeom>
-                    <a:noFill/>
-                    <a:ln w="9525">
-                      <a:noFill/>
-                      <a:headEnd/>
-                      <a:tailEnd/>
-                    </a:ln>
-                  </pic:spPr>
-                </pic:pic>
-              </a:graphicData>
-            </a:graphic>
-          </wp:inline>
-        </w:drawing>
-      </w:r>
-    </w:p>
-    <w:p>
-      <w:pPr>
-        <w:pStyle w:val="BodyText"/>
-      </w:pPr>
-      <w:r>
-        <w:rPr>
-          <w:b/>
-          <w:bCs/>
-        </w:rPr>
-        <w:t xml:space="preserve">Figure 2.</w:t>
-      </w:r>
-      <w:r>
-        <w:t xml:space="preserve"> </w:t>
-      </w:r>
-      <w:r>
-        <w:t xml:space="preserve">Fit time, per-query predict time, and peak memory by method, averaged across the</w:t>
-      </w:r>
-      <w:r>
-        <w:t xml:space="preserve"> </w:t>
-      </w:r>
-      <w:r>
-        <w:t xml:space="preserve">in-house panel. The methods sit within a few points of each other on accuracy (Table 3) and</w:t>
-      </w:r>
-      <w:r>
-        <w:t xml:space="preserve"> </w:t>
-      </w:r>
-      <w:r>
-        <w:t xml:space="preserve">orders of magnitude apart on cost.</w:t>
-      </w:r>
-    </w:p>
-    <w:p>
-      <w:pPr>
-        <w:pStyle w:val="BodyText"/>
-      </w:pPr>
-      <w:r>
         <w:t xml:space="preserve">Accuracy and cost belong in one table: the finding is not where either lands, but how little</w:t>
       </w:r>
       <w:r>
@@ -8395,8 +8318,8 @@
         <w:t xml:space="preserve">exact scores are unaffected.</w:t>
       </w:r>
     </w:p>
-    <w:bookmarkEnd w:id="53"/>
-    <w:bookmarkStart w:id="57" w:name="the-accuracy-speed-frontier"/>
+    <w:bookmarkEnd w:id="50"/>
+    <w:bookmarkStart w:id="54" w:name="the-accuracy-speed-frontier"/>
     <w:p>
       <w:pPr>
         <w:pStyle w:val="Heading2"/>
@@ -8414,18 +8337,18 @@
           <wp:inline>
             <wp:extent cx="5334000" cy="3671222"/>
             <wp:effectExtent b="0" l="0" r="0" t="0"/>
-            <wp:docPr descr="Pareto" title="" id="55" name="Picture"/>
+            <wp:docPr descr="Pareto" title="" id="52" name="Picture"/>
             <a:graphic>
               <a:graphicData uri="http://schemas.openxmlformats.org/drawingml/2006/picture">
                 <pic:pic>
                   <pic:nvPicPr>
-                    <pic:cNvPr descr="/Users/iandriver/Downloads/actinn-jax-benchmark/docs/figures/fig_pareto_liver_intra.png" id="56" name="Picture"/>
+                    <pic:cNvPr descr="/Users/iandriver/Downloads/actinn-jax-benchmark/docs/figures/fig_pareto_liver_intra.png" id="53" name="Picture"/>
                     <pic:cNvPicPr>
                       <a:picLocks noChangeArrowheads="1" noChangeAspect="1"/>
                     </pic:cNvPicPr>
                   </pic:nvPicPr>
                   <pic:blipFill>
-                    <a:blip r:embed="rId54"/>
+                    <a:blip r:embed="rId51"/>
                     <a:stretch>
                       <a:fillRect/>
                     </a:stretch>
@@ -8461,7 +8384,7 @@
           <w:b/>
           <w:bCs/>
         </w:rPr>
-        <w:t xml:space="preserve">Figure 3.</w:t>
+        <w:t xml:space="preserve">Figure 2.</w:t>
       </w:r>
       <w:r>
         <w:t xml:space="preserve"> </w:t>
@@ -8479,7 +8402,7 @@
         <w:t xml:space="preserve"> </w:t>
       </w:r>
       <w:r>
-        <w:t xml:space="preserve">separates it is visible only on the scaling axes of Figure 4.</w:t>
+        <w:t xml:space="preserve">separates it is visible only on the scaling axes of Figure 3.</w:t>
       </w:r>
     </w:p>
     <w:p>
@@ -8562,8 +8485,8 @@
         <w:t xml:space="preserve">from the liver_intra panel and depicts the ranking of Tables 3 and 5.</w:t>
       </w:r>
     </w:p>
-    <w:bookmarkEnd w:id="57"/>
-    <w:bookmarkStart w:id="61" w:name="scaling"/>
+    <w:bookmarkEnd w:id="54"/>
+    <w:bookmarkStart w:id="58" w:name="scaling"/>
     <w:p>
       <w:pPr>
         <w:pStyle w:val="Heading2"/>
@@ -8581,18 +8504,18 @@
           <wp:inline>
             <wp:extent cx="5334000" cy="1970216"/>
             <wp:effectExtent b="0" l="0" r="0" t="0"/>
-            <wp:docPr descr="scaling" title="" id="59" name="Picture"/>
+            <wp:docPr descr="scaling" title="" id="56" name="Picture"/>
             <a:graphic>
               <a:graphicData uri="http://schemas.openxmlformats.org/drawingml/2006/picture">
                 <pic:pic>
                   <pic:nvPicPr>
-                    <pic:cNvPr descr="/Users/iandriver/Downloads/actinn-jax-benchmark/docs/figures/fig_scaling.png" id="60" name="Picture"/>
+                    <pic:cNvPr descr="/Users/iandriver/Downloads/actinn-jax-benchmark/docs/figures/fig_scaling.png" id="57" name="Picture"/>
                     <pic:cNvPicPr>
                       <a:picLocks noChangeArrowheads="1" noChangeAspect="1"/>
                     </pic:cNvPicPr>
                   </pic:nvPicPr>
                   <pic:blipFill>
-                    <a:blip r:embed="rId58"/>
+                    <a:blip r:embed="rId55"/>
                     <a:stretch>
                       <a:fillRect/>
                     </a:stretch>
@@ -8628,7 +8551,7 @@
           <w:b/>
           <w:bCs/>
         </w:rPr>
-        <w:t xml:space="preserve">Figure 4.</w:t>
+        <w:t xml:space="preserve">Figure 3.</w:t>
       </w:r>
       <w:r>
         <w:t xml:space="preserve"> </w:t>
@@ -8745,8 +8668,8 @@
         <w:t xml:space="preserve">per-method peak memory is reported from the isolated-subprocess matrix in §3.2.)</w:t>
       </w:r>
     </w:p>
-    <w:bookmarkEnd w:id="61"/>
-    <w:bookmarkStart w:id="65" w:name="the-broadfocused-annotation-workflow"/>
+    <w:bookmarkEnd w:id="58"/>
+    <w:bookmarkStart w:id="62" w:name="the-broadfocused-annotation-workflow"/>
     <w:p>
       <w:pPr>
         <w:pStyle w:val="Heading2"/>
@@ -8821,18 +8744,18 @@
           <wp:inline>
             <wp:extent cx="5334000" cy="2195377"/>
             <wp:effectExtent b="0" l="0" r="0" t="0"/>
-            <wp:docPr descr="the broad pass and the focused pass on one query" title="" id="63" name="Picture"/>
+            <wp:docPr descr="the broad pass and the focused pass on one query" title="" id="60" name="Picture"/>
             <a:graphic>
               <a:graphicData uri="http://schemas.openxmlformats.org/drawingml/2006/picture">
                 <pic:pic>
                   <pic:nvPicPr>
-                    <pic:cNvPr descr="/Users/iandriver/Downloads/actinn-jax-benchmark/docs/figures/fig_workflow_umap.png" id="64" name="Picture"/>
+                    <pic:cNvPr descr="/Users/iandriver/Downloads/actinn-jax-benchmark/docs/figures/fig_workflow_umap.png" id="61" name="Picture"/>
                     <pic:cNvPicPr>
                       <a:picLocks noChangeArrowheads="1" noChangeAspect="1"/>
                     </pic:cNvPicPr>
                   </pic:nvPicPr>
                   <pic:blipFill>
-                    <a:blip r:embed="rId62"/>
+                    <a:blip r:embed="rId59"/>
                     <a:stretch>
                       <a:fillRect/>
                     </a:stretch>
@@ -8868,7 +8791,7 @@
           <w:b/>
           <w:bCs/>
         </w:rPr>
-        <w:t xml:space="preserve">Figure 5.</w:t>
+        <w:t xml:space="preserve">Figure 4.</w:t>
       </w:r>
       <w:r>
         <w:t xml:space="preserve"> </w:t>
@@ -10708,8 +10631,8 @@
         <w:t xml:space="preserve">tissue → subtype/state), not just a classifier, at classical-method speed throughout.</w:t>
       </w:r>
     </w:p>
-    <w:bookmarkEnd w:id="65"/>
-    <w:bookmarkStart w:id="66" w:name="rejection-abstain"/>
+    <w:bookmarkEnd w:id="62"/>
+    <w:bookmarkStart w:id="63" w:name="rejection-abstain"/>
     <w:p>
       <w:pPr>
         <w:pStyle w:val="Heading2"/>
@@ -11041,8 +10964,8 @@
         <w:t xml:space="preserve">what makes the abstain step usable as a routing decision in the workflow of §3.4.</w:t>
       </w:r>
     </w:p>
-    <w:bookmarkEnd w:id="66"/>
-    <w:bookmarkStart w:id="67" w:name="foundation-model-zero-shot-scprint"/>
+    <w:bookmarkEnd w:id="63"/>
+    <w:bookmarkStart w:id="64" w:name="foundation-model-zero-shot-scprint"/>
     <w:p>
       <w:pPr>
         <w:pStyle w:val="Heading2"/>
@@ -11222,8 +11145,8 @@
         <w:t xml:space="preserve">its raw label predictions are not.</w:t>
       </w:r>
     </w:p>
-    <w:bookmarkEnd w:id="67"/>
-    <w:bookmarkStart w:id="76" w:name="X073cf3caac1f6b108657735a42ae0c9978dc036"/>
+    <w:bookmarkEnd w:id="64"/>
+    <w:bookmarkStart w:id="73" w:name="X073cf3caac1f6b108657735a42ae0c9978dc036"/>
     <w:p>
       <w:pPr>
         <w:pStyle w:val="Heading2"/>
@@ -11273,7 +11196,7 @@
       <w:r>
         <w:t xml:space="preserve"> </w:t>
       </w:r>
-      <w:hyperlink r:id="rId68">
+      <w:hyperlink r:id="rId65">
         <w:r>
           <w:rPr>
             <w:rStyle w:val="Hyperlink"/>
@@ -11384,7 +11307,7 @@
       <w:r>
         <w:t xml:space="preserve"> </w:t>
       </w:r>
-      <w:hyperlink r:id="rId69">
+      <w:hyperlink r:id="rId66">
         <w:r>
           <w:rPr>
             <w:rStyle w:val="Hyperlink"/>
@@ -13197,7 +13120,7 @@
         <w:t xml:space="preserve"> </w:t>
       </w:r>
       <w:r>
-        <w:t xml:space="preserve">hypomap (Figure 6). Crucially, this is</w:t>
+        <w:t xml:space="preserve">hypomap (Figure 5). Crucially, this is</w:t>
       </w:r>
       <w:r>
         <w:t xml:space="preserve"> </w:t>
@@ -13254,7 +13177,7 @@
         <w:t xml:space="preserve"> </w:t>
       </w:r>
       <w:r>
-        <w:t xml:space="preserve">query-cells-per-class check independently flags it (Figure 7) —</w:t>
+        <w:t xml:space="preserve">query-cells-per-class check independently flags it (Figure 6) —</w:t>
       </w:r>
       <w:r>
         <w:t xml:space="preserve"> </w:t>
@@ -13328,18 +13251,18 @@
           <wp:inline>
             <wp:extent cx="5334000" cy="2139510"/>
             <wp:effectExtent b="0" l="0" r="0" t="0"/>
-            <wp:docPr descr="gene budget curve" title="" id="71" name="Picture"/>
+            <wp:docPr descr="gene budget curve" title="" id="68" name="Picture"/>
             <a:graphic>
               <a:graphicData uri="http://schemas.openxmlformats.org/drawingml/2006/picture">
                 <pic:pic>
                   <pic:nvPicPr>
-                    <pic:cNvPr descr="/Users/iandriver/Downloads/actinn-jax-benchmark/docs/figures/gene_budget_curve.png" id="72" name="Picture"/>
+                    <pic:cNvPr descr="/Users/iandriver/Downloads/actinn-jax-benchmark/docs/figures/gene_budget_curve.png" id="69" name="Picture"/>
                     <pic:cNvPicPr>
                       <a:picLocks noChangeArrowheads="1" noChangeAspect="1"/>
                     </pic:cNvPicPr>
                   </pic:nvPicPr>
                   <pic:blipFill>
-                    <a:blip r:embed="rId70"/>
+                    <a:blip r:embed="rId67"/>
                     <a:stretch>
                       <a:fillRect/>
                     </a:stretch>
@@ -13375,7 +13298,7 @@
           <w:b/>
           <w:bCs/>
         </w:rPr>
-        <w:t xml:space="preserve">Figure 6.</w:t>
+        <w:t xml:space="preserve">Figure 5.</w:t>
       </w:r>
       <w:r>
         <w:t xml:space="preserve"> </w:t>
@@ -13405,18 +13328,18 @@
           <wp:inline>
             <wp:extent cx="5334000" cy="2293972"/>
             <wp:effectExtent b="0" l="0" r="0" t="0"/>
-            <wp:docPr descr="gene budget signals" title="" id="74" name="Picture"/>
+            <wp:docPr descr="gene budget signals" title="" id="71" name="Picture"/>
             <a:graphic>
               <a:graphicData uri="http://schemas.openxmlformats.org/drawingml/2006/picture">
                 <pic:pic>
                   <pic:nvPicPr>
-                    <pic:cNvPr descr="/Users/iandriver/Downloads/actinn-jax-benchmark/docs/figures/gene_budget_signals.png" id="75" name="Picture"/>
+                    <pic:cNvPr descr="/Users/iandriver/Downloads/actinn-jax-benchmark/docs/figures/gene_budget_signals.png" id="72" name="Picture"/>
                     <pic:cNvPicPr>
                       <a:picLocks noChangeArrowheads="1" noChangeAspect="1"/>
                     </pic:cNvPicPr>
                   </pic:nvPicPr>
                   <pic:blipFill>
-                    <a:blip r:embed="rId73"/>
+                    <a:blip r:embed="rId70"/>
                     <a:stretch>
                       <a:fillRect/>
                     </a:stretch>
@@ -13452,7 +13375,7 @@
           <w:b/>
           <w:bCs/>
         </w:rPr>
-        <w:t xml:space="preserve">Figure 7.</w:t>
+        <w:t xml:space="preserve">Figure 6.</w:t>
       </w:r>
       <w:r>
         <w:t xml:space="preserve"> </w:t>
@@ -13473,9 +13396,9 @@
         <w:t xml:space="preserve">dataset where more genes hurt.</w:t>
       </w:r>
     </w:p>
-    <w:bookmarkEnd w:id="76"/>
-    <w:bookmarkEnd w:id="77"/>
-    <w:bookmarkStart w:id="79" w:name="discussion"/>
+    <w:bookmarkEnd w:id="73"/>
+    <w:bookmarkEnd w:id="74"/>
+    <w:bookmarkStart w:id="76" w:name="discussion"/>
     <w:p>
       <w:pPr>
         <w:pStyle w:val="Heading1"/>
@@ -14170,7 +14093,7 @@
       <w:r>
         <w:t xml:space="preserve"> </w:t>
       </w:r>
-      <w:hyperlink r:id="rId78">
+      <w:hyperlink r:id="rId75">
         <w:r>
           <w:rPr>
             <w:rStyle w:val="Hyperlink"/>
@@ -14901,8 +14824,8 @@
         <w:t xml:space="preserve">scientist can run, inspect, and run again.</w:t>
       </w:r>
     </w:p>
-    <w:bookmarkEnd w:id="79"/>
-    <w:bookmarkStart w:id="80" w:name="limitations"/>
+    <w:bookmarkEnd w:id="76"/>
+    <w:bookmarkStart w:id="77" w:name="limitations"/>
     <w:p>
       <w:pPr>
         <w:pStyle w:val="Heading1"/>
@@ -15622,8 +15545,8 @@
         <w:t xml:space="preserve">annotation).</w:t>
       </w:r>
     </w:p>
-    <w:bookmarkEnd w:id="80"/>
-    <w:bookmarkStart w:id="86" w:name="data-code-availability"/>
+    <w:bookmarkEnd w:id="77"/>
+    <w:bookmarkStart w:id="83" w:name="data-code-availability"/>
     <w:p>
       <w:pPr>
         <w:pStyle w:val="Heading1"/>
@@ -15673,7 +15596,7 @@
       <w:r>
         <w:t xml:space="preserve"> </w:t>
       </w:r>
-      <w:hyperlink r:id="rId81">
+      <w:hyperlink r:id="rId78">
         <w:r>
           <w:rPr>
             <w:rStyle w:val="Hyperlink"/>
@@ -15797,7 +15720,7 @@
       <w:r>
         <w:t xml:space="preserve"> </w:t>
       </w:r>
-      <w:hyperlink r:id="rId82">
+      <w:hyperlink r:id="rId79">
         <w:r>
           <w:rPr>
             <w:rStyle w:val="Hyperlink"/>
@@ -15820,7 +15743,7 @@
       <w:r>
         <w:t xml:space="preserve"> </w:t>
       </w:r>
-      <w:hyperlink r:id="rId83">
+      <w:hyperlink r:id="rId80">
         <w:r>
           <w:rPr>
             <w:rStyle w:val="Hyperlink"/>
@@ -15913,7 +15836,7 @@
       <w:r>
         <w:t xml:space="preserve"> </w:t>
       </w:r>
-      <w:hyperlink r:id="rId84">
+      <w:hyperlink r:id="rId81">
         <w:r>
           <w:rPr>
             <w:rStyle w:val="Hyperlink"/>
@@ -15942,7 +15865,7 @@
       <w:r>
         <w:t xml:space="preserve"> </w:t>
       </w:r>
-      <w:hyperlink r:id="rId85">
+      <w:hyperlink r:id="rId82">
         <w:r>
           <w:rPr>
             <w:rStyle w:val="Hyperlink"/>
@@ -15960,8 +15883,8 @@
         <w:t xml:space="preserve">condition of that licence and travels inside each shipped model’s build record.</w:t>
       </w:r>
     </w:p>
-    <w:bookmarkEnd w:id="86"/>
-    <w:bookmarkStart w:id="87" w:name="references"/>
+    <w:bookmarkEnd w:id="83"/>
+    <w:bookmarkStart w:id="84" w:name="references"/>
     <w:p>
       <w:pPr>
         <w:pStyle w:val="Heading1"/>
@@ -16216,7 +16139,7 @@
       <w:r>
         <w:t xml:space="preserve"> </w:t>
       </w:r>
-      <w:hyperlink r:id="rId69">
+      <w:hyperlink r:id="rId66">
         <w:r>
           <w:rPr>
             <w:rStyle w:val="Hyperlink"/>
@@ -16830,7 +16753,7 @@
       <w:r>
         <w:t xml:space="preserve"> </w:t>
       </w:r>
-      <w:hyperlink r:id="rId78">
+      <w:hyperlink r:id="rId75">
         <w:r>
           <w:rPr>
             <w:rStyle w:val="Hyperlink"/>
@@ -17010,7 +16933,7 @@
         <w:t xml:space="preserve">.</w:t>
       </w:r>
     </w:p>
-    <w:bookmarkEnd w:id="87"/>
+    <w:bookmarkEnd w:id="84"/>
     <w:sectPr>
       <w:footnotePr>
         <w:numRestart w:val="eachSect"/>

</xml_diff>

<commit_message>
paper: drop the inline rankings from Table 5
The "best method" column already names the leader, so "-- #1 on both" on the liver_cross
row and "(actinn-jax #2)" on liver_intra were restating what the row next to them said. The
0.802 against 0.804 shows second place without being told.

Both facts survive in the paragraph below the table, where they belong: actinn-jax leads the
cross-study liver split and is second on within-dataset liver.
</commit_message>
<xml_diff>
--- a/manuscript/actinn-jax_preprint.docx
+++ b/manuscript/actinn-jax_preprint.docx
@@ -7852,7 +7852,7 @@
               <w:pStyle w:val="Compact"/>
             </w:pPr>
             <w:r>
-              <w:t xml:space="preserve">linear-anova-pca 0.804 (actinn-jax #2)</w:t>
+              <w:t xml:space="preserve">linear-anova-pca 0.804</w:t>
             </w:r>
           </w:p>
         </w:tc>
@@ -7880,7 +7880,7 @@
                 <w:b/>
                 <w:bCs/>
               </w:rPr>
-              <w:t xml:space="preserve">0.686 exact / 0.731 ontology — #1 on both</w:t>
+              <w:t xml:space="preserve">0.686 exact / 0.731 ontology</w:t>
             </w:r>
           </w:p>
         </w:tc>

</xml_diff>

<commit_message>
paper: drop the accuracy heatmap and the narration of how to read the table
Figure 1 showed accuracy by method and dataset; Table 3 and Table 5 carry the same numbers,
and numbers you can read beat a colour you have to look up against a scale.

Removed three sentences that narrate the presentation instead of reporting a result:
  "Accuracy and cost belong in one table: the finding is not where either lands, but how
  little they relate." -- the paragraph under the table makes that point with numbers.
  "Read down the accuracy column, then across." -- now leads with the finding: the top four
  span 0.008 in accuracy, ~130x in predict time and 2.4x in memory.
  "Plotting accuracy against total wall time makes the frontier explicit."

Five figures now, renumbered 2-6 -> 1-5 with the scaling and gene-budget cross-references
updated. Section 3.1 opens on what was measured and goes straight to the table.
</commit_message>
<xml_diff>
--- a/manuscript/actinn-jax_preprint.docx
+++ b/manuscript/actinn-jax_preprint.docx
@@ -5816,7 +5816,7 @@
     </w:p>
     <w:bookmarkEnd w:id="45"/>
     <w:bookmarkEnd w:id="46"/>
-    <w:bookmarkStart w:id="74" w:name="results"/>
+    <w:bookmarkStart w:id="71" w:name="results"/>
     <w:p>
       <w:pPr>
         <w:pStyle w:val="Heading1"/>
@@ -5825,7 +5825,7 @@
         <w:t xml:space="preserve">Results</w:t>
       </w:r>
     </w:p>
-    <w:bookmarkStart w:id="50" w:name="accuracy-and-cost"/>
+    <w:bookmarkStart w:id="47" w:name="accuracy-and-cost"/>
     <w:p>
       <w:pPr>
         <w:pStyle w:val="Heading2"/>
@@ -5839,78 +5839,7 @@
         <w:pStyle w:val="FirstParagraph"/>
       </w:pPr>
       <w:r>
-        <w:drawing>
-          <wp:inline>
-            <wp:extent cx="5334000" cy="4154905"/>
-            <wp:effectExtent b="0" l="0" r="0" t="0"/>
-            <wp:docPr descr="accuracy heatmap" title="" id="48" name="Picture"/>
-            <a:graphic>
-              <a:graphicData uri="http://schemas.openxmlformats.org/drawingml/2006/picture">
-                <pic:pic>
-                  <pic:nvPicPr>
-                    <pic:cNvPr descr="/Users/iandriver/Downloads/actinn-jax-benchmark/docs/figures/fig_accuracy_heatmap.png" id="49" name="Picture"/>
-                    <pic:cNvPicPr>
-                      <a:picLocks noChangeArrowheads="1" noChangeAspect="1"/>
-                    </pic:cNvPicPr>
-                  </pic:nvPicPr>
-                  <pic:blipFill>
-                    <a:blip r:embed="rId47"/>
-                    <a:stretch>
-                      <a:fillRect/>
-                    </a:stretch>
-                  </pic:blipFill>
-                  <pic:spPr bwMode="auto">
-                    <a:xfrm>
-                      <a:off x="0" y="0"/>
-                      <a:ext cx="5334000" cy="4154905"/>
-                    </a:xfrm>
-                    <a:prstGeom prst="rect">
-                      <a:avLst/>
-                    </a:prstGeom>
-                    <a:noFill/>
-                    <a:ln w="9525">
-                      <a:noFill/>
-                      <a:headEnd/>
-                      <a:tailEnd/>
-                    </a:ln>
-                  </pic:spPr>
-                </pic:pic>
-              </a:graphicData>
-            </a:graphic>
-          </wp:inline>
-        </w:drawing>
-      </w:r>
-    </w:p>
-    <w:p>
-      <w:pPr>
-        <w:pStyle w:val="BodyText"/>
-      </w:pPr>
-      <w:r>
-        <w:rPr>
-          <w:b/>
-          <w:bCs/>
-        </w:rPr>
-        <w:t xml:space="preserve">Figure 1.</w:t>
-      </w:r>
-      <w:r>
-        <w:t xml:space="preserve"> </w:t>
-      </w:r>
-      <w:r>
-        <w:t xml:space="preserve">Accuracy by method (rows) and dataset (columns) across the in-house panel.</w:t>
-      </w:r>
-    </w:p>
-    <w:p>
-      <w:pPr>
-        <w:pStyle w:val="BodyText"/>
-      </w:pPr>
-      <w:r>
-        <w:t xml:space="preserve">Accuracy and cost belong in one table: the finding is not where either lands, but how little</w:t>
-      </w:r>
-      <w:r>
-        <w:t xml:space="preserve"> </w:t>
-      </w:r>
-      <w:r>
-        <w:t xml:space="preserve">they relate. Accuracy is the mean over the</w:t>
+        <w:t xml:space="preserve">Accuracy is the mean over the</w:t>
       </w:r>
       <w:r>
         <w:t xml:space="preserve"> </w:t>
@@ -7078,47 +7007,29 @@
         <w:pStyle w:val="BodyText"/>
       </w:pPr>
       <w:r>
-        <w:rPr>
-          <w:b/>
-          <w:bCs/>
-        </w:rPr>
-        <w:t xml:space="preserve">Read down the accuracy column, then across.</w:t>
-      </w:r>
-      <w:r>
-        <w:t xml:space="preserve"> </w:t>
-      </w:r>
-      <w:r>
-        <w:t xml:space="preserve">The top four span 0.008 in accuracy,</w:t>
-      </w:r>
-      <w:r>
-        <w:t xml:space="preserve"> </w:t>
-      </w:r>
-      <w:r>
-        <w:rPr>
-          <w:b/>
-          <w:bCs/>
-        </w:rPr>
-        <w:t xml:space="preserve">~130× in</w:t>
-      </w:r>
-      <w:r>
-        <w:rPr>
-          <w:b/>
-          <w:bCs/>
-        </w:rPr>
-        <w:t xml:space="preserve"> </w:t>
-      </w:r>
-      <w:r>
-        <w:rPr>
-          <w:b/>
-          <w:bCs/>
-        </w:rPr>
-        <w:t xml:space="preserve">predict time</w:t>
-      </w:r>
-      <w:r>
-        <w:t xml:space="preserve"> </w:t>
-      </w:r>
-      <w:r>
-        <w:t xml:space="preserve">(0.34 s to 89 s) and 2.4× in memory. scANVI sits within 0.002 of second place and</w:t>
+        <w:t xml:space="preserve">The top four methods span</w:t>
+      </w:r>
+      <w:r>
+        <w:t xml:space="preserve"> </w:t>
+      </w:r>
+      <w:r>
+        <w:rPr>
+          <w:b/>
+          <w:bCs/>
+        </w:rPr>
+        <w:t xml:space="preserve">0.008 in accuracy, ~130× in predict time</w:t>
+      </w:r>
+      <w:r>
+        <w:t xml:space="preserve"> </w:t>
+      </w:r>
+      <w:r>
+        <w:t xml:space="preserve">(0.34 s to 89 s) and</w:t>
+      </w:r>
+      <w:r>
+        <w:t xml:space="preserve"> </w:t>
+      </w:r>
+      <w:r>
+        <w:t xml:space="preserve">2.4× in memory. scANVI sits within 0.002 of second place and</w:t>
       </w:r>
       <w:r>
         <w:t xml:space="preserve"> </w:t>
@@ -8318,8 +8229,8 @@
         <w:t xml:space="preserve">exact scores are unaffected.</w:t>
       </w:r>
     </w:p>
-    <w:bookmarkEnd w:id="50"/>
-    <w:bookmarkStart w:id="54" w:name="the-accuracy-speed-frontier"/>
+    <w:bookmarkEnd w:id="47"/>
+    <w:bookmarkStart w:id="51" w:name="the-accuracy-speed-frontier"/>
     <w:p>
       <w:pPr>
         <w:pStyle w:val="Heading2"/>
@@ -8337,18 +8248,18 @@
           <wp:inline>
             <wp:extent cx="5334000" cy="3671222"/>
             <wp:effectExtent b="0" l="0" r="0" t="0"/>
-            <wp:docPr descr="Pareto" title="" id="52" name="Picture"/>
+            <wp:docPr descr="Pareto" title="" id="49" name="Picture"/>
             <a:graphic>
               <a:graphicData uri="http://schemas.openxmlformats.org/drawingml/2006/picture">
                 <pic:pic>
                   <pic:nvPicPr>
-                    <pic:cNvPr descr="/Users/iandriver/Downloads/actinn-jax-benchmark/docs/figures/fig_pareto_liver_intra.png" id="53" name="Picture"/>
+                    <pic:cNvPr descr="/Users/iandriver/Downloads/actinn-jax-benchmark/docs/figures/fig_pareto_liver_intra.png" id="50" name="Picture"/>
                     <pic:cNvPicPr>
                       <a:picLocks noChangeArrowheads="1" noChangeAspect="1"/>
                     </pic:cNvPicPr>
                   </pic:nvPicPr>
                   <pic:blipFill>
-                    <a:blip r:embed="rId51"/>
+                    <a:blip r:embed="rId48"/>
                     <a:stretch>
                       <a:fillRect/>
                     </a:stretch>
@@ -8384,7 +8295,7 @@
           <w:b/>
           <w:bCs/>
         </w:rPr>
-        <w:t xml:space="preserve">Figure 2.</w:t>
+        <w:t xml:space="preserve">Figure 1.</w:t>
       </w:r>
       <w:r>
         <w:t xml:space="preserve"> </w:t>
@@ -8402,7 +8313,7 @@
         <w:t xml:space="preserve"> </w:t>
       </w:r>
       <w:r>
-        <w:t xml:space="preserve">separates it is visible only on the scaling axes of Figure 3.</w:t>
+        <w:t xml:space="preserve">separates it is visible only on the scaling axes of Figure 2.</w:t>
       </w:r>
     </w:p>
     <w:p>
@@ -8410,31 +8321,17 @@
         <w:pStyle w:val="BodyText"/>
       </w:pPr>
       <w:r>
-        <w:t xml:space="preserve">Plotting accuracy against total wall time makes the frontier explicit. The</w:t>
-      </w:r>
-      <w:r>
-        <w:t xml:space="preserve"> </w:t>
-      </w:r>
-      <w:r>
-        <w:rPr>
-          <w:b/>
-          <w:bCs/>
-        </w:rPr>
-        <w:t xml:space="preserve">tuned linear</w:t>
-      </w:r>
-      <w:r>
-        <w:rPr>
-          <w:b/>
-          <w:bCs/>
-        </w:rPr>
-        <w:t xml:space="preserve"> </w:t>
-      </w:r>
-      <w:r>
-        <w:rPr>
-          <w:b/>
-          <w:bCs/>
-        </w:rPr>
-        <w:t xml:space="preserve">pipeline</w:t>
+        <w:t xml:space="preserve">The</w:t>
+      </w:r>
+      <w:r>
+        <w:t xml:space="preserve"> </w:t>
+      </w:r>
+      <w:r>
+        <w:rPr>
+          <w:b/>
+          <w:bCs/>
+        </w:rPr>
+        <w:t xml:space="preserve">tuned linear pipeline</w:t>
       </w:r>
       <w:r>
         <w:t xml:space="preserve"> </w:t>
@@ -8485,8 +8382,8 @@
         <w:t xml:space="preserve">from the liver_intra panel and depicts the ranking of Tables 3 and 5.</w:t>
       </w:r>
     </w:p>
-    <w:bookmarkEnd w:id="54"/>
-    <w:bookmarkStart w:id="58" w:name="scaling"/>
+    <w:bookmarkEnd w:id="51"/>
+    <w:bookmarkStart w:id="55" w:name="scaling"/>
     <w:p>
       <w:pPr>
         <w:pStyle w:val="Heading2"/>
@@ -8504,18 +8401,18 @@
           <wp:inline>
             <wp:extent cx="5334000" cy="1970216"/>
             <wp:effectExtent b="0" l="0" r="0" t="0"/>
-            <wp:docPr descr="scaling" title="" id="56" name="Picture"/>
+            <wp:docPr descr="scaling" title="" id="53" name="Picture"/>
             <a:graphic>
               <a:graphicData uri="http://schemas.openxmlformats.org/drawingml/2006/picture">
                 <pic:pic>
                   <pic:nvPicPr>
-                    <pic:cNvPr descr="/Users/iandriver/Downloads/actinn-jax-benchmark/docs/figures/fig_scaling.png" id="57" name="Picture"/>
+                    <pic:cNvPr descr="/Users/iandriver/Downloads/actinn-jax-benchmark/docs/figures/fig_scaling.png" id="54" name="Picture"/>
                     <pic:cNvPicPr>
                       <a:picLocks noChangeArrowheads="1" noChangeAspect="1"/>
                     </pic:cNvPicPr>
                   </pic:nvPicPr>
                   <pic:blipFill>
-                    <a:blip r:embed="rId55"/>
+                    <a:blip r:embed="rId52"/>
                     <a:stretch>
                       <a:fillRect/>
                     </a:stretch>
@@ -8551,7 +8448,7 @@
           <w:b/>
           <w:bCs/>
         </w:rPr>
-        <w:t xml:space="preserve">Figure 3.</w:t>
+        <w:t xml:space="preserve">Figure 2.</w:t>
       </w:r>
       <w:r>
         <w:t xml:space="preserve"> </w:t>
@@ -8668,8 +8565,8 @@
         <w:t xml:space="preserve">per-method peak memory is reported from the isolated-subprocess matrix in §3.2.)</w:t>
       </w:r>
     </w:p>
-    <w:bookmarkEnd w:id="58"/>
-    <w:bookmarkStart w:id="62" w:name="the-broadfocused-annotation-workflow"/>
+    <w:bookmarkEnd w:id="55"/>
+    <w:bookmarkStart w:id="59" w:name="the-broadfocused-annotation-workflow"/>
     <w:p>
       <w:pPr>
         <w:pStyle w:val="Heading2"/>
@@ -8744,18 +8641,18 @@
           <wp:inline>
             <wp:extent cx="5334000" cy="2195377"/>
             <wp:effectExtent b="0" l="0" r="0" t="0"/>
-            <wp:docPr descr="the broad pass and the focused pass on one query" title="" id="60" name="Picture"/>
+            <wp:docPr descr="the broad pass and the focused pass on one query" title="" id="57" name="Picture"/>
             <a:graphic>
               <a:graphicData uri="http://schemas.openxmlformats.org/drawingml/2006/picture">
                 <pic:pic>
                   <pic:nvPicPr>
-                    <pic:cNvPr descr="/Users/iandriver/Downloads/actinn-jax-benchmark/docs/figures/fig_workflow_umap.png" id="61" name="Picture"/>
+                    <pic:cNvPr descr="/Users/iandriver/Downloads/actinn-jax-benchmark/docs/figures/fig_workflow_umap.png" id="58" name="Picture"/>
                     <pic:cNvPicPr>
                       <a:picLocks noChangeArrowheads="1" noChangeAspect="1"/>
                     </pic:cNvPicPr>
                   </pic:nvPicPr>
                   <pic:blipFill>
-                    <a:blip r:embed="rId59"/>
+                    <a:blip r:embed="rId56"/>
                     <a:stretch>
                       <a:fillRect/>
                     </a:stretch>
@@ -8791,7 +8688,7 @@
           <w:b/>
           <w:bCs/>
         </w:rPr>
-        <w:t xml:space="preserve">Figure 4.</w:t>
+        <w:t xml:space="preserve">Figure 3.</w:t>
       </w:r>
       <w:r>
         <w:t xml:space="preserve"> </w:t>
@@ -10631,8 +10528,8 @@
         <w:t xml:space="preserve">tissue → subtype/state), not just a classifier, at classical-method speed throughout.</w:t>
       </w:r>
     </w:p>
-    <w:bookmarkEnd w:id="62"/>
-    <w:bookmarkStart w:id="63" w:name="rejection-abstain"/>
+    <w:bookmarkEnd w:id="59"/>
+    <w:bookmarkStart w:id="60" w:name="rejection-abstain"/>
     <w:p>
       <w:pPr>
         <w:pStyle w:val="Heading2"/>
@@ -10964,8 +10861,8 @@
         <w:t xml:space="preserve">what makes the abstain step usable as a routing decision in the workflow of §3.4.</w:t>
       </w:r>
     </w:p>
-    <w:bookmarkEnd w:id="63"/>
-    <w:bookmarkStart w:id="64" w:name="foundation-model-zero-shot-scprint"/>
+    <w:bookmarkEnd w:id="60"/>
+    <w:bookmarkStart w:id="61" w:name="foundation-model-zero-shot-scprint"/>
     <w:p>
       <w:pPr>
         <w:pStyle w:val="Heading2"/>
@@ -11145,8 +11042,8 @@
         <w:t xml:space="preserve">its raw label predictions are not.</w:t>
       </w:r>
     </w:p>
-    <w:bookmarkEnd w:id="64"/>
-    <w:bookmarkStart w:id="73" w:name="X073cf3caac1f6b108657735a42ae0c9978dc036"/>
+    <w:bookmarkEnd w:id="61"/>
+    <w:bookmarkStart w:id="70" w:name="X073cf3caac1f6b108657735a42ae0c9978dc036"/>
     <w:p>
       <w:pPr>
         <w:pStyle w:val="Heading2"/>
@@ -11196,7 +11093,7 @@
       <w:r>
         <w:t xml:space="preserve"> </w:t>
       </w:r>
-      <w:hyperlink r:id="rId65">
+      <w:hyperlink r:id="rId62">
         <w:r>
           <w:rPr>
             <w:rStyle w:val="Hyperlink"/>
@@ -11307,7 +11204,7 @@
       <w:r>
         <w:t xml:space="preserve"> </w:t>
       </w:r>
-      <w:hyperlink r:id="rId66">
+      <w:hyperlink r:id="rId63">
         <w:r>
           <w:rPr>
             <w:rStyle w:val="Hyperlink"/>
@@ -13120,7 +13017,7 @@
         <w:t xml:space="preserve"> </w:t>
       </w:r>
       <w:r>
-        <w:t xml:space="preserve">hypomap (Figure 5). Crucially, this is</w:t>
+        <w:t xml:space="preserve">hypomap (Figure 4). Crucially, this is</w:t>
       </w:r>
       <w:r>
         <w:t xml:space="preserve"> </w:t>
@@ -13177,7 +13074,7 @@
         <w:t xml:space="preserve"> </w:t>
       </w:r>
       <w:r>
-        <w:t xml:space="preserve">query-cells-per-class check independently flags it (Figure 6) —</w:t>
+        <w:t xml:space="preserve">query-cells-per-class check independently flags it (Figure 5) —</w:t>
       </w:r>
       <w:r>
         <w:t xml:space="preserve"> </w:t>
@@ -13251,18 +13148,18 @@
           <wp:inline>
             <wp:extent cx="5334000" cy="2139510"/>
             <wp:effectExtent b="0" l="0" r="0" t="0"/>
-            <wp:docPr descr="gene budget curve" title="" id="68" name="Picture"/>
+            <wp:docPr descr="gene budget curve" title="" id="65" name="Picture"/>
             <a:graphic>
               <a:graphicData uri="http://schemas.openxmlformats.org/drawingml/2006/picture">
                 <pic:pic>
                   <pic:nvPicPr>
-                    <pic:cNvPr descr="/Users/iandriver/Downloads/actinn-jax-benchmark/docs/figures/gene_budget_curve.png" id="69" name="Picture"/>
+                    <pic:cNvPr descr="/Users/iandriver/Downloads/actinn-jax-benchmark/docs/figures/gene_budget_curve.png" id="66" name="Picture"/>
                     <pic:cNvPicPr>
                       <a:picLocks noChangeArrowheads="1" noChangeAspect="1"/>
                     </pic:cNvPicPr>
                   </pic:nvPicPr>
                   <pic:blipFill>
-                    <a:blip r:embed="rId67"/>
+                    <a:blip r:embed="rId64"/>
                     <a:stretch>
                       <a:fillRect/>
                     </a:stretch>
@@ -13298,7 +13195,7 @@
           <w:b/>
           <w:bCs/>
         </w:rPr>
-        <w:t xml:space="preserve">Figure 5.</w:t>
+        <w:t xml:space="preserve">Figure 4.</w:t>
       </w:r>
       <w:r>
         <w:t xml:space="preserve"> </w:t>
@@ -13328,18 +13225,18 @@
           <wp:inline>
             <wp:extent cx="5334000" cy="2293972"/>
             <wp:effectExtent b="0" l="0" r="0" t="0"/>
-            <wp:docPr descr="gene budget signals" title="" id="71" name="Picture"/>
+            <wp:docPr descr="gene budget signals" title="" id="68" name="Picture"/>
             <a:graphic>
               <a:graphicData uri="http://schemas.openxmlformats.org/drawingml/2006/picture">
                 <pic:pic>
                   <pic:nvPicPr>
-                    <pic:cNvPr descr="/Users/iandriver/Downloads/actinn-jax-benchmark/docs/figures/gene_budget_signals.png" id="72" name="Picture"/>
+                    <pic:cNvPr descr="/Users/iandriver/Downloads/actinn-jax-benchmark/docs/figures/gene_budget_signals.png" id="69" name="Picture"/>
                     <pic:cNvPicPr>
                       <a:picLocks noChangeArrowheads="1" noChangeAspect="1"/>
                     </pic:cNvPicPr>
                   </pic:nvPicPr>
                   <pic:blipFill>
-                    <a:blip r:embed="rId70"/>
+                    <a:blip r:embed="rId67"/>
                     <a:stretch>
                       <a:fillRect/>
                     </a:stretch>
@@ -13375,7 +13272,7 @@
           <w:b/>
           <w:bCs/>
         </w:rPr>
-        <w:t xml:space="preserve">Figure 6.</w:t>
+        <w:t xml:space="preserve">Figure 5.</w:t>
       </w:r>
       <w:r>
         <w:t xml:space="preserve"> </w:t>
@@ -13396,9 +13293,9 @@
         <w:t xml:space="preserve">dataset where more genes hurt.</w:t>
       </w:r>
     </w:p>
-    <w:bookmarkEnd w:id="73"/>
-    <w:bookmarkEnd w:id="74"/>
-    <w:bookmarkStart w:id="76" w:name="discussion"/>
+    <w:bookmarkEnd w:id="70"/>
+    <w:bookmarkEnd w:id="71"/>
+    <w:bookmarkStart w:id="73" w:name="discussion"/>
     <w:p>
       <w:pPr>
         <w:pStyle w:val="Heading1"/>
@@ -14093,7 +13990,7 @@
       <w:r>
         <w:t xml:space="preserve"> </w:t>
       </w:r>
-      <w:hyperlink r:id="rId75">
+      <w:hyperlink r:id="rId72">
         <w:r>
           <w:rPr>
             <w:rStyle w:val="Hyperlink"/>
@@ -14824,8 +14721,8 @@
         <w:t xml:space="preserve">scientist can run, inspect, and run again.</w:t>
       </w:r>
     </w:p>
-    <w:bookmarkEnd w:id="76"/>
-    <w:bookmarkStart w:id="77" w:name="limitations"/>
+    <w:bookmarkEnd w:id="73"/>
+    <w:bookmarkStart w:id="74" w:name="limitations"/>
     <w:p>
       <w:pPr>
         <w:pStyle w:val="Heading1"/>
@@ -15545,8 +15442,8 @@
         <w:t xml:space="preserve">annotation).</w:t>
       </w:r>
     </w:p>
-    <w:bookmarkEnd w:id="77"/>
-    <w:bookmarkStart w:id="83" w:name="data-code-availability"/>
+    <w:bookmarkEnd w:id="74"/>
+    <w:bookmarkStart w:id="80" w:name="data-code-availability"/>
     <w:p>
       <w:pPr>
         <w:pStyle w:val="Heading1"/>
@@ -15596,7 +15493,7 @@
       <w:r>
         <w:t xml:space="preserve"> </w:t>
       </w:r>
-      <w:hyperlink r:id="rId78">
+      <w:hyperlink r:id="rId75">
         <w:r>
           <w:rPr>
             <w:rStyle w:val="Hyperlink"/>
@@ -15720,7 +15617,7 @@
       <w:r>
         <w:t xml:space="preserve"> </w:t>
       </w:r>
-      <w:hyperlink r:id="rId79">
+      <w:hyperlink r:id="rId76">
         <w:r>
           <w:rPr>
             <w:rStyle w:val="Hyperlink"/>
@@ -15743,7 +15640,7 @@
       <w:r>
         <w:t xml:space="preserve"> </w:t>
       </w:r>
-      <w:hyperlink r:id="rId80">
+      <w:hyperlink r:id="rId77">
         <w:r>
           <w:rPr>
             <w:rStyle w:val="Hyperlink"/>
@@ -15836,7 +15733,7 @@
       <w:r>
         <w:t xml:space="preserve"> </w:t>
       </w:r>
-      <w:hyperlink r:id="rId81">
+      <w:hyperlink r:id="rId78">
         <w:r>
           <w:rPr>
             <w:rStyle w:val="Hyperlink"/>
@@ -15865,7 +15762,7 @@
       <w:r>
         <w:t xml:space="preserve"> </w:t>
       </w:r>
-      <w:hyperlink r:id="rId82">
+      <w:hyperlink r:id="rId79">
         <w:r>
           <w:rPr>
             <w:rStyle w:val="Hyperlink"/>
@@ -15883,8 +15780,8 @@
         <w:t xml:space="preserve">condition of that licence and travels inside each shipped model’s build record.</w:t>
       </w:r>
     </w:p>
-    <w:bookmarkEnd w:id="83"/>
-    <w:bookmarkStart w:id="84" w:name="references"/>
+    <w:bookmarkEnd w:id="80"/>
+    <w:bookmarkStart w:id="81" w:name="references"/>
     <w:p>
       <w:pPr>
         <w:pStyle w:val="Heading1"/>
@@ -16139,7 +16036,7 @@
       <w:r>
         <w:t xml:space="preserve"> </w:t>
       </w:r>
-      <w:hyperlink r:id="rId66">
+      <w:hyperlink r:id="rId63">
         <w:r>
           <w:rPr>
             <w:rStyle w:val="Hyperlink"/>
@@ -16753,7 +16650,7 @@
       <w:r>
         <w:t xml:space="preserve"> </w:t>
       </w:r>
-      <w:hyperlink r:id="rId75">
+      <w:hyperlink r:id="rId72">
         <w:r>
           <w:rPr>
             <w:rStyle w:val="Hyperlink"/>
@@ -16933,7 +16830,7 @@
         <w:t xml:space="preserve">.</w:t>
       </w:r>
     </w:p>
-    <w:bookmarkEnd w:id="84"/>
+    <w:bookmarkEnd w:id="81"/>
     <w:sectPr>
       <w:footnotePr>
         <w:numRestart w:val="eachSect"/>

</xml_diff>

<commit_message>
paper: stop telling the reader which findings matter
Five places announced a result was significant instead of letting it be:

  "scTOP fails on two of the six, for a reason worth recording."
  -> "scTOP fails on two of the six." The mechanism follows either way.

  "Two limits are worth stating on the spot." -> "Two limits apply."
  "It does not, and the test is worth stating plainly." -> "It does not."
  "Most importantly, the external validation is somebody else s" -> "And the external
  validation is somebody else s".
  "Crucially, this is selectable without test labels" -> "The budget is selectable without
  test labels".

A finding that needs to be labelled important usually is not, and one that is does not need
the label. Nothing was removed except the labelling.
</commit_message>
<xml_diff>
--- a/manuscript/actinn-jax_preprint.docx
+++ b/manuscript/actinn-jax_preprint.docx
@@ -640,31 +640,31 @@
         <w:t xml:space="preserve"> </w:t>
       </w:r>
       <w:r>
-        <w:t xml:space="preserve">fixed across all methods and reported in full. Most importantly, the</w:t>
-      </w:r>
-      <w:r>
-        <w:t xml:space="preserve"> </w:t>
-      </w:r>
-      <w:r>
-        <w:rPr>
-          <w:b/>
-          <w:bCs/>
-        </w:rPr>
-        <w:t xml:space="preserve">external validation is</w:t>
-      </w:r>
-      <w:r>
-        <w:rPr>
-          <w:b/>
-          <w:bCs/>
-        </w:rPr>
-        <w:t xml:space="preserve"> </w:t>
-      </w:r>
-      <w:r>
-        <w:rPr>
-          <w:b/>
-          <w:bCs/>
-        </w:rPr>
-        <w:t xml:space="preserve">somebody else’s</w:t>
+        <w:t xml:space="preserve">fixed across all methods and reported in full. And the</w:t>
+      </w:r>
+      <w:r>
+        <w:t xml:space="preserve"> </w:t>
+      </w:r>
+      <w:r>
+        <w:rPr>
+          <w:b/>
+          <w:bCs/>
+        </w:rPr>
+        <w:t xml:space="preserve">external validation is somebody</w:t>
+      </w:r>
+      <w:r>
+        <w:rPr>
+          <w:b/>
+          <w:bCs/>
+        </w:rPr>
+        <w:t xml:space="preserve"> </w:t>
+      </w:r>
+      <w:r>
+        <w:rPr>
+          <w:b/>
+          <w:bCs/>
+        </w:rPr>
+        <w:t xml:space="preserve">else’s</w:t>
       </w:r>
       <w:r>
         <w:t xml:space="preserve">: Open Problems</w:t>
@@ -10030,7 +10030,7 @@
         <w:t xml:space="preserve"> </w:t>
       </w:r>
       <w:r>
-        <w:t xml:space="preserve">being comparable to them. Two limits are worth stating on the spot. The ablation above was run</w:t>
+        <w:t xml:space="preserve">being comparable to them. Two limits apply. The ablation above was run</w:t>
       </w:r>
       <w:r>
         <w:t xml:space="preserve"> </w:t>
@@ -10248,13 +10248,13 @@
         <w:t xml:space="preserve"> </w:t>
       </w:r>
       <w:r>
-        <w:t xml:space="preserve">assumption is that a better broad call should also make the focused call better. It does not,</w:t>
-      </w:r>
-      <w:r>
-        <w:t xml:space="preserve"> </w:t>
-      </w:r>
-      <w:r>
-        <w:t xml:space="preserve">and the test is worth stating plainly. On the leakage-free cross-study</w:t>
+        <w:t xml:space="preserve">assumption is that a better broad call should also make the focused call better. It does not.</w:t>
+      </w:r>
+      <w:r>
+        <w:t xml:space="preserve"> </w:t>
+      </w:r>
+      <w:r>
+        <w:t xml:space="preserve">On the leakage-free cross-study</w:t>
       </w:r>
       <w:r>
         <w:t xml:space="preserve"> </w:t>
@@ -12767,7 +12767,7 @@
           <w:b/>
           <w:bCs/>
         </w:rPr>
-        <w:t xml:space="preserve">scTOP fails on two of the six, for a reason worth recording.</w:t>
+        <w:t xml:space="preserve">scTOP fails on two of the six.</w:t>
       </w:r>
       <w:r>
         <w:t xml:space="preserve"> </w:t>
@@ -13017,7 +13017,7 @@
         <w:t xml:space="preserve"> </w:t>
       </w:r>
       <w:r>
-        <w:t xml:space="preserve">hypomap (Figure 4). Crucially, this is</w:t>
+        <w:t xml:space="preserve">hypomap (Figure 4). The budget is</w:t>
       </w:r>
       <w:r>
         <w:t xml:space="preserve"> </w:t>

</xml_diff>

<commit_message>
paper: drop the memory failure prediction, keep the measurement
"predicts ~32 GB and failure at atlas scale" was two problems in one clause. "Failure" is
only defined against a memory budget, and the budget was the 48 GB of the machine the sweep
ran on -- a fact about that laptop, not about the method. And the sentence was reporting a
prediction we made and got wrong, which is development history rather than a result.

The finding does not need either. Extrapolating the linear pipeline s small-reference
footprint overstates its atlas-scale peak by ~2.4x; the measured figure is 13.2 GB at 49k
reference cells, because its feature-selection step caps the dense matrix at 20,000 genes
rather than the full gene set. That is machine-independent and is the whole point of the
bullet -- measure, do not extrapolate.

The ~32 GB figure and the prediction that produced it stay in SCALING_MEMORY.md, which is a
working record and the right place for them.
</commit_message>
<xml_diff>
--- a/manuscript/actinn-jax_preprint.docx
+++ b/manuscript/actinn-jax_preprint.docx
@@ -15231,21 +15231,21 @@
           <w:b/>
           <w:bCs/>
         </w:rPr>
-        <w:t xml:space="preserve">actinn-jax’s memory advantage is bounded, and the linear pipeline scales further than</w:t>
-      </w:r>
-      <w:r>
-        <w:rPr>
-          <w:b/>
-          <w:bCs/>
-        </w:rPr>
-        <w:t xml:space="preserve"> </w:t>
-      </w:r>
-      <w:r>
-        <w:rPr>
-          <w:b/>
-          <w:bCs/>
-        </w:rPr>
-        <w:t xml:space="preserve">extrapolation suggests</w:t>
+        <w:t xml:space="preserve">actinn-jax’s memory advantage is bounded, and the linear pipeline scales further than a</w:t>
+      </w:r>
+      <w:r>
+        <w:rPr>
+          <w:b/>
+          <w:bCs/>
+        </w:rPr>
+        <w:t xml:space="preserve"> </w:t>
+      </w:r>
+      <w:r>
+        <w:rPr>
+          <w:b/>
+          <w:bCs/>
+        </w:rPr>
+        <w:t xml:space="preserve">naive extrapolation implies</w:t>
       </w:r>
       <w:r>
         <w:t xml:space="preserve"> </w:t>
@@ -15266,13 +15266,13 @@
         <w:t xml:space="preserve"> </w:t>
       </w:r>
       <w:r>
-        <w:t xml:space="preserve">linear pipeline’s small-reference footprint predicts ~32 GB and failure at atlas scale;</w:t>
-      </w:r>
-      <w:r>
-        <w:t xml:space="preserve"> </w:t>
-      </w:r>
-      <w:r>
-        <w:t xml:space="preserve">measured, it uses</w:t>
+        <w:t xml:space="preserve">linear pipeline’s small-reference footprint overstates its atlas-scale peak by ~2.4× — the</w:t>
+      </w:r>
+      <w:r>
+        <w:t xml:space="preserve"> </w:t>
+      </w:r>
+      <w:r>
+        <w:t xml:space="preserve">measured figure is</w:t>
       </w:r>
       <w:r>
         <w:t xml:space="preserve"> </w:t>
@@ -15288,13 +15288,19 @@
         <w:t xml:space="preserve"> </w:t>
       </w:r>
       <w:r>
-        <w:t xml:space="preserve">and completes, because its feature-selection step caps the</w:t>
-      </w:r>
-      <w:r>
-        <w:t xml:space="preserve"> </w:t>
-      </w:r>
-      <w:r>
-        <w:t xml:space="preserve">dense matrix at 20,000 genes, well below the full gene set. The linear/actinn-jax memory ratio is likewise</w:t>
+        <w:t xml:space="preserve">at 49k reference cells — because its feature-selection step</w:t>
+      </w:r>
+      <w:r>
+        <w:t xml:space="preserve"> </w:t>
+      </w:r>
+      <w:r>
+        <w:t xml:space="preserve">caps the dense matrix at 20,000 genes rather than the full gene set. The linear/actinn-jax</w:t>
+      </w:r>
+      <w:r>
+        <w:t xml:space="preserve"> </w:t>
+      </w:r>
+      <w:r>
+        <w:t xml:space="preserve">memory ratio is likewise</w:t>
       </w:r>
       <w:r>
         <w:t xml:space="preserve"> </w:t>
@@ -15322,7 +15328,7 @@
         <w:t xml:space="preserve"> </w:t>
       </w:r>
       <w:r>
-        <w:t xml:space="preserve">projections in this setting should be measured, not extrapolated.</w:t>
+        <w:t xml:space="preserve">in this setting should be measured, not extrapolated.</w:t>
       </w:r>
     </w:p>
     <w:p>

</xml_diff>

<commit_message>
paper: repo docs become numbered supplementary notes; US spellings
Links like [`SCALING_MEMORY.md`](SCALING_MEMORY.md) reached the PDF as bare filenames. The
build script drops a link whose visible text ends in .md, but backticks made the text end
in a backtick instead, so four documents leaked through in seven places -- and the ones it
DID strip left the reader with no pointer at all, which is the worse failure.

All fifteen referenced documents are now supplementary notes S1-S15, numbered in order of
first appearance, listed with titles under Data & code availability. In-text references are
(S3) rather than a filename. Zero .md strings survive into the PDF.

Also: behaviour -> behavior, favourable/unfavourable -> favorable/unfavorable, matching the
rest of the manuscript.
</commit_message>
<xml_diff>
--- a/manuscript/actinn-jax_preprint.docx
+++ b/manuscript/actinn-jax_preprint.docx
@@ -214,7 +214,7 @@
         <w:t xml:space="preserve">label_projection</w:t>
       </w:r>
       <w:r>
-        <w:t xml:space="preserve">, whose datasets, metrics and ranking we did not choose. We report the results as a decision aid (accuracy-per-second, accuracy-per-byte, and behaviour from 3k to 49k reference cells), then use actinn-jax to demonstrate</w:t>
+        <w:t xml:space="preserve">, whose datasets, metrics and ranking we did not choose. We report the results as a decision aid (accuracy-per-second, accuracy-per-byte, and behavior from 3k to 49k reference cells), then use actinn-jax to demonstrate</w:t>
       </w:r>
       <w:r>
         <w:t xml:space="preserve"> </w:t>
@@ -400,7 +400,7 @@
         <w:t xml:space="preserve"> </w:t>
       </w:r>
       <w:r>
-        <w:t xml:space="preserve">operations in single-cell RNA-seq. The method landscape is large (survey),</w:t>
+        <w:t xml:space="preserve">operations in single-cell RNA-seq. The method landscape is large (S4),</w:t>
       </w:r>
       <w:r>
         <w:t xml:space="preserve"> </w:t>
@@ -610,7 +610,7 @@
         <w:t xml:space="preserve"> </w:t>
       </w:r>
       <w:r>
-        <w:t xml:space="preserve">dataset, so none appears on a favourable subset, and the two</w:t>
+        <w:t xml:space="preserve">dataset, so none appears on a favorable subset, and the two</w:t>
       </w:r>
       <w:r>
         <w:t xml:space="preserve"> </w:t>
@@ -634,7 +634,7 @@
         <w:t xml:space="preserve"> </w:t>
       </w:r>
       <w:r>
-        <w:t xml:space="preserve">while the linear baseline is tuned, which is the unfavourable direction (§5). Metrics are</w:t>
+        <w:t xml:space="preserve">while the linear baseline is tuned, which is the unfavorable direction (§5). Metrics are</w:t>
       </w:r>
       <w:r>
         <w:t xml:space="preserve"> </w:t>
@@ -2666,7 +2666,7 @@
         <w:t xml:space="preserve"> </w:t>
       </w:r>
       <w:r>
-        <w:t xml:space="preserve">accuracy/cost matrix of §3.1 on all six datasets, so none is compared on a favourable subset.</w:t>
+        <w:t xml:space="preserve">accuracy/cost matrix of §3.1 on all six datasets, so none is compared on a favorable subset.</w:t>
       </w:r>
       <w:r>
         <w:t xml:space="preserve"> </w:t>
@@ -4292,7 +4292,7 @@
         <w:t xml:space="preserve"> </w:t>
       </w:r>
       <w:r>
-        <w:t xml:space="preserve">driven by one command ( in the</w:t>
+        <w:t xml:space="preserve">driven by one command (S5 in the</w:t>
       </w:r>
       <w:r>
         <w:t xml:space="preserve"> </w:t>
@@ -4809,7 +4809,13 @@
         <w:t xml:space="preserve"> </w:t>
       </w:r>
       <w:r>
-        <w:t xml:space="preserve">vocabulary and the hierarchy from an existing pretrained annotator. Keras/TensorFlow and JAX cannot share a process,</w:t>
+        <w:t xml:space="preserve">vocabulary and the hierarchy from an existing pretrained annotator</w:t>
+      </w:r>
+      <w:r>
+        <w:t xml:space="preserve"> </w:t>
+      </w:r>
+      <w:r>
+        <w:t xml:space="preserve">(S6). Keras/TensorFlow and JAX cannot share a process,</w:t>
       </w:r>
       <w:r>
         <w:t xml:space="preserve"> </w:t>
@@ -5383,7 +5389,7 @@
         <w:t xml:space="preserve"> </w:t>
       </w:r>
       <w:r>
-        <w:t xml:space="preserve">agreement across donors and datasets.</w:t>
+        <w:t xml:space="preserve">agreement across donors and datasets (S7).</w:t>
       </w:r>
     </w:p>
     <w:bookmarkEnd w:id="39"/>
@@ -5435,7 +5441,13 @@
         <w:t xml:space="preserve"> </w:t>
       </w:r>
       <w:r>
-        <w:t xml:space="preserve">reference grows, which no single reference size can show.</w:t>
+        <w:t xml:space="preserve">reference grows, which no single reference size can show</w:t>
+      </w:r>
+      <w:r>
+        <w:t xml:space="preserve"> </w:t>
+      </w:r>
+      <w:r>
+        <w:t xml:space="preserve">(S3).</w:t>
       </w:r>
     </w:p>
     <w:bookmarkEnd w:id="40"/>
@@ -5489,7 +5501,7 @@
         <w:t xml:space="preserve"> </w:t>
       </w:r>
       <w:r>
-        <w:t xml:space="preserve">supplies the</w:t>
+        <w:t xml:space="preserve">(S8) supplies the</w:t>
       </w:r>
       <w:r>
         <w:t xml:space="preserve"> </w:t>
@@ -7627,19 +7639,7 @@
         <w:t xml:space="preserve"> </w:t>
       </w:r>
       <w:r>
-        <w:t xml:space="preserve">a real atlas (§5,</w:t>
-      </w:r>
-      <w:r>
-        <w:t xml:space="preserve"> </w:t>
-      </w:r>
-      <w:r>
-        <w:rPr>
-          <w:rStyle w:val="VerbatimChar"/>
-        </w:rPr>
-        <w:t xml:space="preserve">SCALING_MEMORY.md</w:t>
-      </w:r>
-      <w:r>
-        <w:t xml:space="preserve">), while scTOP is built for small,</w:t>
+        <w:t xml:space="preserve">a real atlas (§5, S3), while scTOP is built for small,</w:t>
       </w:r>
       <w:r>
         <w:t xml:space="preserve"> </w:t>
@@ -8929,7 +8929,7 @@
         <w:t xml:space="preserve"> </w:t>
       </w:r>
       <w:r>
-        <w:t xml:space="preserve">force-labeled (see the smooth abstain curve of §3.5). This is the</w:t>
+        <w:t xml:space="preserve">force-labeled (S9, and the smooth abstain curve of §3.5). This is the</w:t>
       </w:r>
       <w:r>
         <w:t xml:space="preserve"> </w:t>
@@ -9016,7 +9016,7 @@
         <w:t xml:space="preserve"> </w:t>
       </w:r>
       <w:r>
-        <w:t xml:space="preserve">three atlases plus a census-wide sample. On</w:t>
+        <w:t xml:space="preserve">three atlases plus a census-wide sample (S6). On</w:t>
       </w:r>
       <w:r>
         <w:t xml:space="preserve"> </w:t>
@@ -10131,7 +10131,7 @@
         <w:t xml:space="preserve"> </w:t>
       </w:r>
       <w:r>
-        <w:t xml:space="preserve">protocol breadth is far below human’s 487 datasets.</w:t>
+        <w:t xml:space="preserve">protocol breadth is far below human’s 487 datasets (S10).</w:t>
       </w:r>
     </w:p>
     <w:p>
@@ -10263,7 +10263,16 @@
         <w:t xml:space="preserve">0.72 / 0.86</w:t>
       </w:r>
       <w:r>
-        <w:t xml:space="preserve">. Refinement is where fine-grained accuracy comes</w:t>
+        <w:t xml:space="preserve"> </w:t>
+      </w:r>
+      <w:r>
+        <w:t xml:space="preserve">(S11,</w:t>
+      </w:r>
+      <w:r>
+        <w:t xml:space="preserve"> </w:t>
+      </w:r>
+      <w:r>
+        <w:t xml:space="preserve">S12). Refinement is where fine-grained accuracy comes</w:t>
       </w:r>
       <w:r>
         <w:t xml:space="preserve"> </w:t>
@@ -10438,16 +10447,7 @@
         <w:t xml:space="preserve"> </w:t>
       </w:r>
       <w:r>
-        <w:t xml:space="preserve">none of them claims (</w:t>
-      </w:r>
-      <w:r>
-        <w:rPr>
-          <w:rStyle w:val="VerbatimChar"/>
-        </w:rPr>
-        <w:t xml:space="preserve">PAN_HUMAN_AZIMUTH.md</w:t>
-      </w:r>
-      <w:r>
-        <w:t xml:space="preserve">).</w:t>
+        <w:t xml:space="preserve">none of them claims (S13).</w:t>
       </w:r>
     </w:p>
     <w:p>
@@ -10478,7 +10478,10 @@
         <w:t xml:space="preserve">foundation-model-guided coarse→fine hierarchy</w:t>
       </w:r>
       <w:r>
-        <w:t xml:space="preserve">: a foundation model discovers</w:t>
+        <w:t xml:space="preserve"> </w:t>
+      </w:r>
+      <w:r>
+        <w:t xml:space="preserve">(S14, S15): a foundation model discovers</w:t>
       </w:r>
       <w:r>
         <w:t xml:space="preserve"> </w:t>
@@ -10542,7 +10545,7 @@
         <w:t xml:space="preserve"> </w:t>
       </w:r>
       <w:r>
-        <w:t xml:space="preserve">within-one-zone, generalizing across donors and datasets — a</w:t>
+        <w:t xml:space="preserve">within-one-zone, generalizing across donors and datasets (S7) — a</w:t>
       </w:r>
       <w:r>
         <w:t xml:space="preserve"> </w:t>
@@ -11056,7 +11059,13 @@
         <w:t xml:space="preserve"> </w:t>
       </w:r>
       <w:r>
-        <w:t xml:space="preserve">are not a drop-in annotator. This is exactly why our two-stage workflow uses scPRINT’s</w:t>
+        <w:t xml:space="preserve">are not a drop-in annotator. This is exactly why our two-stage workflow</w:t>
+      </w:r>
+      <w:r>
+        <w:t xml:space="preserve"> </w:t>
+      </w:r>
+      <w:r>
+        <w:t xml:space="preserve">(S14) uses scPRINT’s</w:t>
       </w:r>
       <w:r>
         <w:t xml:space="preserve"> </w:t>
@@ -11156,7 +11165,7 @@
         <w:t xml:space="preserve"> </w:t>
       </w:r>
       <w:r>
-        <w:t xml:space="preserve">published v2.0.0 leaderboard.</w:t>
+        <w:t xml:space="preserve">published v2.0.0 leaderboard (S8).</w:t>
       </w:r>
     </w:p>
     <w:p>
@@ -13489,16 +13498,7 @@
         <w:t xml:space="preserve"> </w:t>
       </w:r>
       <w:r>
-        <w:t xml:space="preserve">(</w:t>
-      </w:r>
-      <w:r>
-        <w:rPr>
-          <w:rStyle w:val="VerbatimChar"/>
-        </w:rPr>
-        <w:t xml:space="preserve">PAN_HUMAN_AZIMUTH.md</w:t>
-      </w:r>
-      <w:r>
-        <w:t xml:space="preserve">) are independent support, from a group with</w:t>
+        <w:t xml:space="preserve">(S13) are independent support, from a group with</w:t>
       </w:r>
       <w:r>
         <w:t xml:space="preserve"> </w:t>
@@ -13568,16 +13568,7 @@
         <w:t xml:space="preserve"> </w:t>
       </w:r>
       <w:r>
-        <w:t xml:space="preserve">(</w:t>
-      </w:r>
-      <w:r>
-        <w:rPr>
-          <w:rStyle w:val="VerbatimChar"/>
-        </w:rPr>
-        <w:t xml:space="preserve">PROTOCLOUD.md</w:t>
-      </w:r>
-      <w:r>
-        <w:t xml:space="preserve">). The richer model pays off where it has the data to</w:t>
+        <w:t xml:space="preserve">(S2). The richer model pays off where it has the data to</w:t>
       </w:r>
       <w:r>
         <w:t xml:space="preserve"> </w:t>
@@ -14053,16 +14044,7 @@
         <w:t xml:space="preserve"> </w:t>
       </w:r>
       <w:r>
-        <w:t xml:space="preserve">(</w:t>
-      </w:r>
-      <w:r>
-        <w:rPr>
-          <w:rStyle w:val="VerbatimChar"/>
-        </w:rPr>
-        <w:t xml:space="preserve">PAN_HUMAN_AZIMUTH.md</w:t>
-      </w:r>
-      <w:r>
-        <w:t xml:space="preserve">) ships a pretrained hierarchical</w:t>
+        <w:t xml:space="preserve">(S13) ships a pretrained hierarchical</w:t>
       </w:r>
       <w:r>
         <w:t xml:space="preserve"> </w:t>
@@ -14641,7 +14623,7 @@
         <w:t xml:space="preserve"> </w:t>
       </w:r>
       <w:r>
-        <w:t xml:space="preserve">measures behaviour on biology the corpus never saw.</w:t>
+        <w:t xml:space="preserve">measures behavior on biology the corpus never saw.</w:t>
       </w:r>
     </w:p>
     <w:p>
@@ -14782,16 +14764,7 @@
         <w:t xml:space="preserve"> </w:t>
       </w:r>
       <w:r>
-        <w:t xml:space="preserve">on the 86-type blood+gut set (+4.2 pt) (</w:t>
-      </w:r>
-      <w:r>
-        <w:rPr>
-          <w:rStyle w:val="VerbatimChar"/>
-        </w:rPr>
-        <w:t xml:space="preserve">SIMPLE_BASELINES.md</w:t>
-      </w:r>
-      <w:r>
-        <w:t xml:space="preserve">).</w:t>
+        <w:t xml:space="preserve">on the 86-type blood+gut set (+4.2 pt) (S1).</w:t>
       </w:r>
       <w:r>
         <w:t xml:space="preserve"> </w:t>
@@ -14885,16 +14858,7 @@
         <w:t xml:space="preserve"> </w:t>
       </w:r>
       <w:r>
-        <w:t xml:space="preserve">(</w:t>
-      </w:r>
-      <w:r>
-        <w:rPr>
-          <w:rStyle w:val="VerbatimChar"/>
-        </w:rPr>
-        <w:t xml:space="preserve">SCALING_MEMORY.md</w:t>
-      </w:r>
-      <w:r>
-        <w:t xml:space="preserve">). Extrapolating the</w:t>
+        <w:t xml:space="preserve">(S3). Extrapolating the</w:t>
       </w:r>
       <w:r>
         <w:t xml:space="preserve"> </w:t>
@@ -15420,14 +15384,36 @@
         <w:t xml:space="preserve">condition of that licence and travels inside each shipped model’s build record.</w:t>
       </w:r>
     </w:p>
-    <w:bookmarkEnd w:id="80"/>
-    <w:bookmarkStart w:id="81" w:name="references"/>
-    <w:p>
-      <w:pPr>
-        <w:pStyle w:val="Heading1"/>
-      </w:pPr>
-      <w:r>
-        <w:t xml:space="preserve">References</w:t>
+    <w:p>
+      <w:pPr>
+        <w:pStyle w:val="BodyText"/>
+      </w:pPr>
+      <w:r>
+        <w:rPr>
+          <w:b/>
+          <w:bCs/>
+        </w:rPr>
+        <w:t xml:space="preserve">Supplementary notes.</w:t>
+      </w:r>
+      <w:r>
+        <w:t xml:space="preserve"> </w:t>
+      </w:r>
+      <w:r>
+        <w:t xml:space="preserve">Extended results and protocols, in the</w:t>
+      </w:r>
+      <w:r>
+        <w:t xml:space="preserve"> </w:t>
+      </w:r>
+      <w:hyperlink r:id="rId33">
+        <w:r>
+          <w:rPr>
+            <w:rStyle w:val="Hyperlink"/>
+          </w:rPr>
+          <w:t xml:space="preserve">benchmark repository</w:t>
+        </w:r>
+      </w:hyperlink>
+      <w:r>
+        <w:t xml:space="preserve">:</w:t>
       </w:r>
     </w:p>
     <w:p>
@@ -15436,6 +15422,346 @@
         <w:numPr>
           <w:ilvl w:val="0"/>
           <w:numId w:val="1008"/>
+        </w:numPr>
+      </w:pPr>
+      <w:r>
+        <w:rPr>
+          <w:b/>
+          <w:bCs/>
+        </w:rPr>
+        <w:t xml:space="preserve">S1</w:t>
+      </w:r>
+      <w:r>
+        <w:t xml:space="preserve"> </w:t>
+      </w:r>
+      <w:r>
+        <w:t xml:space="preserve">— Tuned linear pipeline and scTOP baselines</w:t>
+      </w:r>
+    </w:p>
+    <w:p>
+      <w:pPr>
+        <w:pStyle w:val="Compact"/>
+        <w:numPr>
+          <w:ilvl w:val="0"/>
+          <w:numId w:val="1008"/>
+        </w:numPr>
+      </w:pPr>
+      <w:r>
+        <w:rPr>
+          <w:b/>
+          <w:bCs/>
+        </w:rPr>
+        <w:t xml:space="preserve">S2</w:t>
+      </w:r>
+      <w:r>
+        <w:t xml:space="preserve"> </w:t>
+      </w:r>
+      <w:r>
+        <w:t xml:space="preserve">— ProtoCloud comparison</w:t>
+      </w:r>
+    </w:p>
+    <w:p>
+      <w:pPr>
+        <w:pStyle w:val="Compact"/>
+        <w:numPr>
+          <w:ilvl w:val="0"/>
+          <w:numId w:val="1008"/>
+        </w:numPr>
+      </w:pPr>
+      <w:r>
+        <w:rPr>
+          <w:b/>
+          <w:bCs/>
+        </w:rPr>
+        <w:t xml:space="preserve">S3</w:t>
+      </w:r>
+      <w:r>
+        <w:t xml:space="preserve"> </w:t>
+      </w:r>
+      <w:r>
+        <w:t xml:space="preserve">— Scaling and memory to atlas size</w:t>
+      </w:r>
+    </w:p>
+    <w:p>
+      <w:pPr>
+        <w:pStyle w:val="Compact"/>
+        <w:numPr>
+          <w:ilvl w:val="0"/>
+          <w:numId w:val="1008"/>
+        </w:numPr>
+      </w:pPr>
+      <w:r>
+        <w:rPr>
+          <w:b/>
+          <w:bCs/>
+        </w:rPr>
+        <w:t xml:space="preserve">S4</w:t>
+      </w:r>
+      <w:r>
+        <w:t xml:space="preserve"> </w:t>
+      </w:r>
+      <w:r>
+        <w:t xml:space="preserve">— Survey of cell-type annotation methods</w:t>
+      </w:r>
+    </w:p>
+    <w:p>
+      <w:pPr>
+        <w:pStyle w:val="Compact"/>
+        <w:numPr>
+          <w:ilvl w:val="0"/>
+          <w:numId w:val="1008"/>
+        </w:numPr>
+      </w:pPr>
+      <w:r>
+        <w:rPr>
+          <w:b/>
+          <w:bCs/>
+        </w:rPr>
+        <w:t xml:space="preserve">S5</w:t>
+      </w:r>
+      <w:r>
+        <w:t xml:space="preserve"> </w:t>
+      </w:r>
+      <w:r>
+        <w:t xml:space="preserve">— Rebuilding the broad reference</w:t>
+      </w:r>
+    </w:p>
+    <w:p>
+      <w:pPr>
+        <w:pStyle w:val="Compact"/>
+        <w:numPr>
+          <w:ilvl w:val="0"/>
+          <w:numId w:val="1008"/>
+        </w:numPr>
+      </w:pPr>
+      <w:r>
+        <w:rPr>
+          <w:b/>
+          <w:bCs/>
+        </w:rPr>
+        <w:t xml:space="preserve">S6</w:t>
+      </w:r>
+      <w:r>
+        <w:t xml:space="preserve"> </w:t>
+      </w:r>
+      <w:r>
+        <w:t xml:space="preserve">— Distilling Pan-human Azimuth</w:t>
+      </w:r>
+    </w:p>
+    <w:p>
+      <w:pPr>
+        <w:pStyle w:val="Compact"/>
+        <w:numPr>
+          <w:ilvl w:val="0"/>
+          <w:numId w:val="1008"/>
+        </w:numPr>
+      </w:pPr>
+      <w:r>
+        <w:rPr>
+          <w:b/>
+          <w:bCs/>
+        </w:rPr>
+        <w:t xml:space="preserve">S7</w:t>
+      </w:r>
+      <w:r>
+        <w:t xml:space="preserve"> </w:t>
+      </w:r>
+      <w:r>
+        <w:t xml:space="preserve">— Hepatocyte zonation</w:t>
+      </w:r>
+    </w:p>
+    <w:p>
+      <w:pPr>
+        <w:pStyle w:val="Compact"/>
+        <w:numPr>
+          <w:ilvl w:val="0"/>
+          <w:numId w:val="1008"/>
+        </w:numPr>
+      </w:pPr>
+      <w:r>
+        <w:rPr>
+          <w:b/>
+          <w:bCs/>
+        </w:rPr>
+        <w:t xml:space="preserve">S8</w:t>
+      </w:r>
+      <w:r>
+        <w:t xml:space="preserve"> </w:t>
+      </w:r>
+      <w:r>
+        <w:t xml:space="preserve">— Open Problems label projection</w:t>
+      </w:r>
+    </w:p>
+    <w:p>
+      <w:pPr>
+        <w:pStyle w:val="Compact"/>
+        <w:numPr>
+          <w:ilvl w:val="0"/>
+          <w:numId w:val="1008"/>
+        </w:numPr>
+      </w:pPr>
+      <w:r>
+        <w:rPr>
+          <w:b/>
+          <w:bCs/>
+        </w:rPr>
+        <w:t xml:space="preserve">S9</w:t>
+      </w:r>
+      <w:r>
+        <w:t xml:space="preserve"> </w:t>
+      </w:r>
+      <w:r>
+        <w:t xml:space="preserve">— Refinement and abstention</w:t>
+      </w:r>
+    </w:p>
+    <w:p>
+      <w:pPr>
+        <w:pStyle w:val="Compact"/>
+        <w:numPr>
+          <w:ilvl w:val="0"/>
+          <w:numId w:val="1008"/>
+        </w:numPr>
+      </w:pPr>
+      <w:r>
+        <w:rPr>
+          <w:b/>
+          <w:bCs/>
+        </w:rPr>
+        <w:t xml:space="preserve">S10</w:t>
+      </w:r>
+      <w:r>
+        <w:t xml:space="preserve"> </w:t>
+      </w:r>
+      <w:r>
+        <w:t xml:space="preserve">— Pan-mouse reference</w:t>
+      </w:r>
+    </w:p>
+    <w:p>
+      <w:pPr>
+        <w:pStyle w:val="Compact"/>
+        <w:numPr>
+          <w:ilvl w:val="0"/>
+          <w:numId w:val="1008"/>
+        </w:numPr>
+      </w:pPr>
+      <w:r>
+        <w:rPr>
+          <w:b/>
+          <w:bCs/>
+        </w:rPr>
+        <w:t xml:space="preserve">S11</w:t>
+      </w:r>
+      <w:r>
+        <w:t xml:space="preserve"> </w:t>
+      </w:r>
+      <w:r>
+        <w:t xml:space="preserve">— HLiCA liver reference</w:t>
+      </w:r>
+    </w:p>
+    <w:p>
+      <w:pPr>
+        <w:pStyle w:val="Compact"/>
+        <w:numPr>
+          <w:ilvl w:val="0"/>
+          <w:numId w:val="1008"/>
+        </w:numPr>
+      </w:pPr>
+      <w:r>
+        <w:rPr>
+          <w:b/>
+          <w:bCs/>
+        </w:rPr>
+        <w:t xml:space="preserve">S12</w:t>
+      </w:r>
+      <w:r>
+        <w:t xml:space="preserve"> </w:t>
+      </w:r>
+      <w:r>
+        <w:t xml:space="preserve">— HLiCA edge cases</w:t>
+      </w:r>
+    </w:p>
+    <w:p>
+      <w:pPr>
+        <w:pStyle w:val="Compact"/>
+        <w:numPr>
+          <w:ilvl w:val="0"/>
+          <w:numId w:val="1008"/>
+        </w:numPr>
+      </w:pPr>
+      <w:r>
+        <w:rPr>
+          <w:b/>
+          <w:bCs/>
+        </w:rPr>
+        <w:t xml:space="preserve">S13</w:t>
+      </w:r>
+      <w:r>
+        <w:t xml:space="preserve"> </w:t>
+      </w:r>
+      <w:r>
+        <w:t xml:space="preserve">— Pan-human Azimuth as broad pass and teacher</w:t>
+      </w:r>
+    </w:p>
+    <w:p>
+      <w:pPr>
+        <w:pStyle w:val="Compact"/>
+        <w:numPr>
+          <w:ilvl w:val="0"/>
+          <w:numId w:val="1008"/>
+        </w:numPr>
+      </w:pPr>
+      <w:r>
+        <w:rPr>
+          <w:b/>
+          <w:bCs/>
+        </w:rPr>
+        <w:t xml:space="preserve">S14</w:t>
+      </w:r>
+      <w:r>
+        <w:t xml:space="preserve"> </w:t>
+      </w:r>
+      <w:r>
+        <w:t xml:space="preserve">— Two-stage model flow</w:t>
+      </w:r>
+    </w:p>
+    <w:p>
+      <w:pPr>
+        <w:pStyle w:val="Compact"/>
+        <w:numPr>
+          <w:ilvl w:val="0"/>
+          <w:numId w:val="1008"/>
+        </w:numPr>
+      </w:pPr>
+      <w:r>
+        <w:rPr>
+          <w:b/>
+          <w:bCs/>
+        </w:rPr>
+        <w:t xml:space="preserve">S15</w:t>
+      </w:r>
+      <w:r>
+        <w:t xml:space="preserve"> </w:t>
+      </w:r>
+      <w:r>
+        <w:t xml:space="preserve">— Two-stage hierarchy experiments</w:t>
+      </w:r>
+    </w:p>
+    <w:bookmarkEnd w:id="80"/>
+    <w:bookmarkStart w:id="81" w:name="references"/>
+    <w:p>
+      <w:pPr>
+        <w:pStyle w:val="Heading1"/>
+      </w:pPr>
+      <w:r>
+        <w:t xml:space="preserve">References</w:t>
+      </w:r>
+    </w:p>
+    <w:p>
+      <w:pPr>
+        <w:pStyle w:val="Compact"/>
+        <w:numPr>
+          <w:ilvl w:val="0"/>
+          <w:numId w:val="1009"/>
         </w:numPr>
       </w:pPr>
       <w:r>
@@ -15473,7 +15799,7 @@
         <w:pStyle w:val="Compact"/>
         <w:numPr>
           <w:ilvl w:val="0"/>
-          <w:numId w:val="1008"/>
+          <w:numId w:val="1009"/>
         </w:numPr>
       </w:pPr>
       <w:r>
@@ -15515,7 +15841,7 @@
         <w:pStyle w:val="Compact"/>
         <w:numPr>
           <w:ilvl w:val="0"/>
-          <w:numId w:val="1008"/>
+          <w:numId w:val="1009"/>
         </w:numPr>
       </w:pPr>
       <w:r>
@@ -15557,7 +15883,7 @@
         <w:pStyle w:val="Compact"/>
         <w:numPr>
           <w:ilvl w:val="0"/>
-          <w:numId w:val="1008"/>
+          <w:numId w:val="1009"/>
         </w:numPr>
       </w:pPr>
       <w:r>
@@ -15599,7 +15925,7 @@
         <w:pStyle w:val="Compact"/>
         <w:numPr>
           <w:ilvl w:val="0"/>
-          <w:numId w:val="1008"/>
+          <w:numId w:val="1009"/>
         </w:numPr>
       </w:pPr>
       <w:r>
@@ -15625,7 +15951,7 @@
         <w:pStyle w:val="Compact"/>
         <w:numPr>
           <w:ilvl w:val="0"/>
-          <w:numId w:val="1008"/>
+          <w:numId w:val="1009"/>
         </w:numPr>
       </w:pPr>
       <w:r>
@@ -15651,7 +15977,7 @@
         <w:pStyle w:val="Compact"/>
         <w:numPr>
           <w:ilvl w:val="0"/>
-          <w:numId w:val="1008"/>
+          <w:numId w:val="1009"/>
         </w:numPr>
       </w:pPr>
       <w:r>
@@ -15693,7 +16019,7 @@
         <w:pStyle w:val="Compact"/>
         <w:numPr>
           <w:ilvl w:val="0"/>
-          <w:numId w:val="1008"/>
+          <w:numId w:val="1009"/>
         </w:numPr>
       </w:pPr>
       <w:r>
@@ -15735,7 +16061,7 @@
         <w:pStyle w:val="Compact"/>
         <w:numPr>
           <w:ilvl w:val="0"/>
-          <w:numId w:val="1008"/>
+          <w:numId w:val="1009"/>
         </w:numPr>
       </w:pPr>
       <w:r>
@@ -15777,7 +16103,7 @@
         <w:pStyle w:val="Compact"/>
         <w:numPr>
           <w:ilvl w:val="0"/>
-          <w:numId w:val="1008"/>
+          <w:numId w:val="1009"/>
         </w:numPr>
       </w:pPr>
       <w:r>
@@ -15819,7 +16145,7 @@
         <w:pStyle w:val="Compact"/>
         <w:numPr>
           <w:ilvl w:val="0"/>
-          <w:numId w:val="1008"/>
+          <w:numId w:val="1009"/>
         </w:numPr>
       </w:pPr>
       <w:r>
@@ -15861,7 +16187,7 @@
         <w:pStyle w:val="Compact"/>
         <w:numPr>
           <w:ilvl w:val="0"/>
-          <w:numId w:val="1008"/>
+          <w:numId w:val="1009"/>
         </w:numPr>
       </w:pPr>
       <w:r>
@@ -15903,7 +16229,7 @@
         <w:pStyle w:val="Compact"/>
         <w:numPr>
           <w:ilvl w:val="0"/>
-          <w:numId w:val="1008"/>
+          <w:numId w:val="1009"/>
         </w:numPr>
       </w:pPr>
       <w:r>
@@ -15945,7 +16271,7 @@
         <w:pStyle w:val="Compact"/>
         <w:numPr>
           <w:ilvl w:val="0"/>
-          <w:numId w:val="1008"/>
+          <w:numId w:val="1009"/>
         </w:numPr>
       </w:pPr>
       <w:r>
@@ -15987,7 +16313,7 @@
         <w:pStyle w:val="Compact"/>
         <w:numPr>
           <w:ilvl w:val="0"/>
-          <w:numId w:val="1008"/>
+          <w:numId w:val="1009"/>
         </w:numPr>
       </w:pPr>
       <w:r>
@@ -16029,7 +16355,7 @@
         <w:pStyle w:val="Compact"/>
         <w:numPr>
           <w:ilvl w:val="0"/>
-          <w:numId w:val="1008"/>
+          <w:numId w:val="1009"/>
         </w:numPr>
       </w:pPr>
       <w:r>
@@ -16071,7 +16397,7 @@
         <w:pStyle w:val="Compact"/>
         <w:numPr>
           <w:ilvl w:val="0"/>
-          <w:numId w:val="1008"/>
+          <w:numId w:val="1009"/>
         </w:numPr>
       </w:pPr>
       <w:r>
@@ -16097,7 +16423,7 @@
         <w:pStyle w:val="Compact"/>
         <w:numPr>
           <w:ilvl w:val="0"/>
-          <w:numId w:val="1008"/>
+          <w:numId w:val="1009"/>
         </w:numPr>
       </w:pPr>
       <w:r>
@@ -16139,7 +16465,7 @@
         <w:pStyle w:val="Compact"/>
         <w:numPr>
           <w:ilvl w:val="0"/>
-          <w:numId w:val="1008"/>
+          <w:numId w:val="1009"/>
         </w:numPr>
       </w:pPr>
       <w:r>
@@ -16181,7 +16507,7 @@
         <w:pStyle w:val="Compact"/>
         <w:numPr>
           <w:ilvl w:val="0"/>
-          <w:numId w:val="1008"/>
+          <w:numId w:val="1009"/>
         </w:numPr>
       </w:pPr>
       <w:r>
@@ -16223,7 +16549,7 @@
         <w:pStyle w:val="Compact"/>
         <w:numPr>
           <w:ilvl w:val="0"/>
-          <w:numId w:val="1008"/>
+          <w:numId w:val="1009"/>
         </w:numPr>
       </w:pPr>
       <w:r>
@@ -16265,7 +16591,7 @@
         <w:pStyle w:val="Compact"/>
         <w:numPr>
           <w:ilvl w:val="0"/>
-          <w:numId w:val="1008"/>
+          <w:numId w:val="1009"/>
         </w:numPr>
       </w:pPr>
       <w:r>
@@ -16307,7 +16633,7 @@
         <w:pStyle w:val="Compact"/>
         <w:numPr>
           <w:ilvl w:val="0"/>
-          <w:numId w:val="1008"/>
+          <w:numId w:val="1009"/>
         </w:numPr>
       </w:pPr>
       <w:r>
@@ -16349,7 +16675,7 @@
         <w:pStyle w:val="Compact"/>
         <w:numPr>
           <w:ilvl w:val="0"/>
-          <w:numId w:val="1008"/>
+          <w:numId w:val="1009"/>
         </w:numPr>
       </w:pPr>
       <w:r>
@@ -16391,7 +16717,7 @@
         <w:pStyle w:val="Compact"/>
         <w:numPr>
           <w:ilvl w:val="0"/>
-          <w:numId w:val="1008"/>
+          <w:numId w:val="1009"/>
         </w:numPr>
       </w:pPr>
       <w:r>
@@ -16433,7 +16759,7 @@
         <w:pStyle w:val="Compact"/>
         <w:numPr>
           <w:ilvl w:val="0"/>
-          <w:numId w:val="1008"/>
+          <w:numId w:val="1009"/>
         </w:numPr>
       </w:pPr>
       <w:r>
@@ -16848,6 +17174,9 @@
     <w:abstractNumId w:val="991"/>
   </w:num>
   <w:num w:numId="1008">
+    <w:abstractNumId w:val="991"/>
+  </w:num>
+  <w:num w:numId="1009">
     <w:abstractNumId w:val="99411"/>
     <w:lvlOverride w:ilvl="0">
       <w:startOverride w:val="1"/>

</xml_diff>

<commit_message>
paper: cite the tagged release, not the branch, for reproduction
A bare repository URL points at whatever the default branch holds when someone
reads the paper, which is not necessarily what produced its numbers. Data & code
availability now names the v1.0.0 tag as the version to cite, and says plainly
that the branch may move on.

No Zenodo DOI for the code: the integration is not connected to the account that
holds the references deposit, and a permanent tag at a fixed commit gets most of
the same guarantee. The references deposit is unaffected and still carries its
own DOI.

Co-Authored-By: Claude Opus 5 <noreply@anthropic.com>
</commit_message>
<xml_diff>
--- a/manuscript/actinn-jax_preprint.docx
+++ b/manuscript/actinn-jax_preprint.docx
@@ -15417,7 +15417,7 @@
       </w:r>
     </w:p>
     <w:bookmarkEnd w:id="83"/>
-    <w:bookmarkStart w:id="89" w:name="data-code-availability"/>
+    <w:bookmarkStart w:id="90" w:name="data-code-availability"/>
     <w:p>
       <w:pPr>
         <w:pStyle w:val="Heading1"/>
@@ -15462,12 +15462,40 @@
         <w:t xml:space="preserve"> </w:t>
       </w:r>
       <w:r>
-        <w:t xml:space="preserve">result tables including the unified eleven-method matrix, and the figure scripts. The</w:t>
+        <w:t xml:space="preserve">result tables including the unified eleven-method matrix, and the figure scripts. The state</w:t>
+      </w:r>
+      <w:r>
+        <w:t xml:space="preserve"> </w:t>
+      </w:r>
+      <w:r>
+        <w:t xml:space="preserve">that produced this manuscript is tagged</w:t>
       </w:r>
       <w:r>
         <w:t xml:space="preserve"> </w:t>
       </w:r>
       <w:hyperlink r:id="rId84">
+        <w:r>
+          <w:rPr>
+            <w:rStyle w:val="Hyperlink"/>
+            <w:b/>
+            <w:bCs/>
+          </w:rPr>
+          <w:t xml:space="preserve">v1.0.0</w:t>
+        </w:r>
+      </w:hyperlink>
+      <w:r>
+        <w:t xml:space="preserve">, which is</w:t>
+      </w:r>
+      <w:r>
+        <w:t xml:space="preserve"> </w:t>
+      </w:r>
+      <w:r>
+        <w:t xml:space="preserve">the version to cite for reproduction; the default branch may move on. The</w:t>
+      </w:r>
+      <w:r>
+        <w:t xml:space="preserve"> </w:t>
+      </w:r>
+      <w:hyperlink r:id="rId85">
         <w:r>
           <w:rPr>
             <w:rStyle w:val="Hyperlink"/>
@@ -15591,7 +15619,7 @@
       <w:r>
         <w:t xml:space="preserve"> </w:t>
       </w:r>
-      <w:hyperlink r:id="rId85">
+      <w:hyperlink r:id="rId86">
         <w:r>
           <w:rPr>
             <w:rStyle w:val="Hyperlink"/>
@@ -15614,7 +15642,7 @@
       <w:r>
         <w:t xml:space="preserve"> </w:t>
       </w:r>
-      <w:hyperlink r:id="rId86">
+      <w:hyperlink r:id="rId87">
         <w:r>
           <w:rPr>
             <w:rStyle w:val="Hyperlink"/>
@@ -15707,7 +15735,7 @@
       <w:r>
         <w:t xml:space="preserve"> </w:t>
       </w:r>
-      <w:hyperlink r:id="rId87">
+      <w:hyperlink r:id="rId88">
         <w:r>
           <w:rPr>
             <w:rStyle w:val="Hyperlink"/>
@@ -15736,7 +15764,7 @@
       <w:r>
         <w:t xml:space="preserve"> </w:t>
       </w:r>
-      <w:hyperlink r:id="rId88">
+      <w:hyperlink r:id="rId89">
         <w:r>
           <w:rPr>
             <w:rStyle w:val="Hyperlink"/>
@@ -15819,8 +15847,8 @@
         <w:t xml:space="preserve">splits — and Tables S1–S3, the method and dataset descriptions and per-dataset accuracy.</w:t>
       </w:r>
     </w:p>
-    <w:bookmarkEnd w:id="89"/>
-    <w:bookmarkStart w:id="90" w:name="references"/>
+    <w:bookmarkEnd w:id="90"/>
+    <w:bookmarkStart w:id="91" w:name="references"/>
     <w:p>
       <w:pPr>
         <w:pStyle w:val="Heading1"/>
@@ -16869,7 +16897,7 @@
         <w:t xml:space="preserve">.</w:t>
       </w:r>
     </w:p>
-    <w:bookmarkEnd w:id="90"/>
+    <w:bookmarkEnd w:id="91"/>
     <w:sectPr>
       <w:footnotePr>
         <w:numRestart w:val="eachSect"/>

</xml_diff>

<commit_message>
paper: cite the archived code DOI
The benchmark repository is now deposited on Zenodo, so Data & code availability
cites doi:10.5281/zenodo.21911372 rather than a branch URL or a tag.

That is the concept DOI, deliberately: it resolves to the most recent release,
so cutting a later tag adds a version under the same identifier instead of
stranding the citation. The version DOI for this release is
10.5281/zenodo.21911373. Both verified to resolve. The references deposit keeps
its own pair, and the paper now carries one DOI for code and one for data.

Co-Authored-By: Claude Opus 5 <noreply@anthropic.com>
</commit_message>
<xml_diff>
--- a/manuscript/actinn-jax_preprint.docx
+++ b/manuscript/actinn-jax_preprint.docx
@@ -15462,13 +15462,13 @@
         <w:t xml:space="preserve"> </w:t>
       </w:r>
       <w:r>
-        <w:t xml:space="preserve">result tables including the unified eleven-method matrix, and the figure scripts. The state</w:t>
-      </w:r>
-      <w:r>
-        <w:t xml:space="preserve"> </w:t>
-      </w:r>
-      <w:r>
-        <w:t xml:space="preserve">that produced this manuscript is tagged</w:t>
+        <w:t xml:space="preserve">result tables including the unified eleven-method matrix, and the figure scripts. It is</w:t>
+      </w:r>
+      <w:r>
+        <w:t xml:space="preserve"> </w:t>
+      </w:r>
+      <w:r>
+        <w:t xml:space="preserve">archived at</w:t>
       </w:r>
       <w:r>
         <w:t xml:space="preserve"> </w:t>
@@ -15477,20 +15477,27 @@
         <w:r>
           <w:rPr>
             <w:rStyle w:val="Hyperlink"/>
-            <w:b/>
-            <w:bCs/>
           </w:rPr>
-          <w:t xml:space="preserve">v1.0.0</w:t>
+          <w:t xml:space="preserve">doi:10.5281/zenodo.21911372</w:t>
         </w:r>
       </w:hyperlink>
       <w:r>
-        <w:t xml:space="preserve">, which is</w:t>
-      </w:r>
-      <w:r>
-        <w:t xml:space="preserve"> </w:t>
-      </w:r>
-      <w:r>
-        <w:t xml:space="preserve">the version to cite for reproduction; the default branch may move on. The</w:t>
+        <w:t xml:space="preserve"> </w:t>
+      </w:r>
+      <w:r>
+        <w:t xml:space="preserve">(MIT; a</w:t>
+      </w:r>
+      <w:r>
+        <w:t xml:space="preserve"> </w:t>
+      </w:r>
+      <w:r>
+        <w:t xml:space="preserve">concept DOI that resolves to the most recent release), which is what to cite for reproduction</w:t>
+      </w:r>
+      <w:r>
+        <w:t xml:space="preserve"> </w:t>
+      </w:r>
+      <w:r>
+        <w:t xml:space="preserve">rather than the default branch, since the branch may move on. The</w:t>
       </w:r>
       <w:r>
         <w:t xml:space="preserve"> </w:t>

</xml_diff>

<commit_message>
abstract: close with where the code and references actually are
"We release the reimplementation, the harness and the pre-trained references"
told a reader what exists without telling them where to get it. Replaced with
the two repository URLs and the Zenodo DOI the references are archived under --
the references live on Zenodo and are fetched by the package, so naming only a
GitHub URL for them would have been wrong.

273 words.

Co-Authored-By: Claude Opus 5 <noreply@anthropic.com>
</commit_message>
<xml_diff>
--- a/manuscript/actinn-jax_preprint.docx
+++ b/manuscript/actinn-jax_preprint.docx
@@ -133,7 +133,7 @@
         <w:t xml:space="preserve"> </w:t>
       </w:r>
       <w:r>
-        <w:t xml:space="preserve">beats none of them: the value is knowing which calls to trust. We release the reimplementation, the harness and the pre-trained references.</w:t>
+        <w:t xml:space="preserve">beats none of them: the value is knowing which calls to trust. Code and pre-trained references are available at github.com/iandriver/actinn-jax, github.com/iandriver/actinn-jax-benchmark and doi:10.5281/zenodo.21688150.</w:t>
       </w:r>
     </w:p>
     <w:p>
@@ -9416,7 +9416,7 @@
       <w:r>
         <w:drawing>
           <wp:inline>
-            <wp:extent cx="5334000" cy="3539981"/>
+            <wp:extent cx="5334000" cy="3543185"/>
             <wp:effectExtent b="0" l="0" r="0" t="0"/>
             <wp:docPr descr="scaling" title="" id="53" name="Picture"/>
             <a:graphic>
@@ -9437,7 +9437,7 @@
                   <pic:spPr bwMode="auto">
                     <a:xfrm>
                       <a:off x="0" y="0"/>
-                      <a:ext cx="5334000" cy="3539981"/>
+                      <a:ext cx="5334000" cy="3543185"/>
                     </a:xfrm>
                     <a:prstGeom prst="rect">
                       <a:avLst/>

</xml_diff>

<commit_message>
figures: drop the apologetics from Figure 3's caption
The caption ended with two sentences explaining what it had chosen not to draw
and why. Neither told a reader anything about the result. What remains states
what the panels show and what the error bars cover.

Co-Authored-By: Claude Opus 5 <noreply@anthropic.com>
</commit_message>
<xml_diff>
--- a/manuscript/actinn-jax_preprint.docx
+++ b/manuscript/actinn-jax_preprint.docx
@@ -11720,25 +11720,13 @@
         <w:t xml:space="preserve"> </w:t>
       </w:r>
       <w:r>
-        <w:t xml:space="preserve">the reference (1,035 to 16,398 cells on lung), so they narrow from left to right; each point</w:t>
-      </w:r>
-      <w:r>
-        <w:t xml:space="preserve"> </w:t>
-      </w:r>
-      <w:r>
-        <w:t xml:space="preserve">is a single run, so they cover sampling of the query and not run-to-run variation. Peak memory</w:t>
-      </w:r>
-      <w:r>
-        <w:t xml:space="preserve"> </w:t>
-      </w:r>
-      <w:r>
-        <w:t xml:space="preserve">is not a proportion and carries none. Fit time is not plotted: the 47k liver point was measured</w:t>
-      </w:r>
-      <w:r>
-        <w:t xml:space="preserve"> </w:t>
-      </w:r>
-      <w:r>
-        <w:t xml:space="preserve">under CPU contention, so a cost axis there would report scheduling rather than scaling.</w:t>
+        <w:t xml:space="preserve">the reference (1,035 to 16,398 cells on lung), so they narrow from left to right; each point is</w:t>
+      </w:r>
+      <w:r>
+        <w:t xml:space="preserve"> </w:t>
+      </w:r>
+      <w:r>
+        <w:t xml:space="preserve">a single run.</w:t>
       </w:r>
     </w:p>
     <w:p>

</xml_diff>